<commit_message>
docs: restructure mechanism proposal around approach and staged outputs
Lead with why conventional rollout approaches fail and the five design
principles, then detail the five stages with concrete work items and
deliverables, and add layered benefits with verification methods.

Drop the effort-commitment section; the three mechanism asks now follow
the reasoning rather than opening the document.

Co-authored-by: peterli0913 <peterli0913@users.noreply.github.com>
</commit_message>
<xml_diff>
--- a/AI辅助生产推进机制建议.docx
+++ b/AI辅助生产推进机制建议.docx
@@ -4,7 +4,7 @@
   <w:body>
     <w:p>
       <w:pPr>
-        <w:spacing w:before="0" w:after="320"/>
+        <w:spacing w:before="0" w:after="280"/>
         <w:jc w:val="center"/>
       </w:pPr>
       <w:r>
@@ -60,7 +60,7 @@
           <w:color w:val="595959"/>
           <w:sz w:val="21"/>
         </w:rPr>
-        <w:t>申请设立 AI 辅助生产推进的汇报窗口、联络机制与数据查询权限</w:t>
+        <w:t>汇报 AI 辅助生产的推进思路与阶段安排，并申请三项机制支持</w:t>
       </w:r>
     </w:p>
     <w:p>
@@ -91,7 +91,7 @@
         <w:pBdr>
           <w:top w:val="single" w:sz="6" w:space="1" w:color="BFBFBF"/>
         </w:pBdr>
-        <w:spacing w:before="200" w:after="40"/>
+        <w:spacing w:before="180" w:after="20"/>
       </w:pPr>
     </w:p>
     <w:p>
@@ -110,7 +110,7 @@
     </w:p>
     <w:p>
       <w:pPr>
-        <w:ind w:left="0" w:firstLine="420"/>
+        <w:ind w:firstLine="420"/>
       </w:pPr>
       <w:r>
         <w:rPr>
@@ -124,7 +124,7 @@
     </w:p>
     <w:p>
       <w:pPr>
-        <w:ind w:left="0" w:firstLine="420"/>
+        <w:ind w:firstLine="420"/>
       </w:pPr>
       <w:r>
         <w:rPr>
@@ -138,7 +138,21 @@
     </w:p>
     <w:p>
       <w:pPr>
-        <w:ind w:left="0" w:firstLine="420"/>
+        <w:spacing w:before="280" w:after="100"/>
+      </w:pPr>
+      <w:r>
+        <w:rPr>
+          <w:rFonts w:ascii="Microsoft YaHei" w:hAnsi="Microsoft YaHei" w:eastAsia="Microsoft YaHei"/>
+          <w:b/>
+          <w:color w:val="000000"/>
+          <w:sz w:val="25"/>
+        </w:rPr>
+        <w:t>二、常规做法的失败风险</w:t>
+      </w:r>
+    </w:p>
+    <w:p>
+      <w:pPr>
+        <w:ind w:firstLine="420"/>
       </w:pPr>
       <w:r>
         <w:rPr>
@@ -147,7 +161,457 @@
           <w:color w:val="1A1A1A"/>
           <w:sz w:val="22"/>
         </w:rPr>
-        <w:t>为使该项工作具备稳定的组织依托、避免因协调不畅而停滞，现就推进机制提出以下建议。所列三项均不涉及预算与人员编制。</w:t>
+        <w:t>同类工作在多数企业推进不下去，原因通常不在技术，而在推进方式。以下五种常规做法均存在明显的失败路径，本方案予以规避。</w:t>
+      </w:r>
+    </w:p>
+    <w:tbl>
+      <w:tblPr>
+        <w:tblStyle w:val="TableGrid"/>
+        <w:tblW w:type="auto" w:w="0"/>
+        <w:jc w:val="center"/>
+        <w:tblLook w:firstColumn="1" w:firstRow="1" w:lastColumn="0" w:lastRow="0" w:noHBand="0" w:noVBand="1" w:val="04A0"/>
+      </w:tblPr>
+      <w:tblGrid>
+        <w:gridCol w:w="4589"/>
+        <w:gridCol w:w="4589"/>
+      </w:tblGrid>
+      <w:tr>
+        <w:tc>
+          <w:tcPr>
+            <w:tcW w:type="dxa" w:w="3061"/>
+            <w:shd w:val="clear" w:color="auto" w:fill="EDEFF3"/>
+          </w:tcPr>
+          <w:p>
+            <w:pPr>
+              <w:spacing w:after="20" w:line="276" w:lineRule="auto"/>
+            </w:pPr>
+            <w:r/>
+            <w:r>
+              <w:rPr>
+                <w:rFonts w:ascii="Microsoft YaHei" w:hAnsi="Microsoft YaHei" w:eastAsia="Microsoft YaHei"/>
+                <w:b/>
+                <w:color w:val="000000"/>
+                <w:sz w:val="19"/>
+              </w:rPr>
+              <w:t>常规做法</w:t>
+            </w:r>
+          </w:p>
+        </w:tc>
+        <w:tc>
+          <w:tcPr>
+            <w:tcW w:type="dxa" w:w="5443"/>
+            <w:shd w:val="clear" w:color="auto" w:fill="EDEFF3"/>
+          </w:tcPr>
+          <w:p>
+            <w:pPr>
+              <w:spacing w:after="20" w:line="276" w:lineRule="auto"/>
+            </w:pPr>
+            <w:r/>
+            <w:r>
+              <w:rPr>
+                <w:rFonts w:ascii="Microsoft YaHei" w:hAnsi="Microsoft YaHei" w:eastAsia="Microsoft YaHei"/>
+                <w:b/>
+                <w:color w:val="000000"/>
+                <w:sz w:val="19"/>
+              </w:rPr>
+              <w:t>典型结果</w:t>
+            </w:r>
+          </w:p>
+        </w:tc>
+      </w:tr>
+      <w:tr>
+        <w:tc>
+          <w:tcPr>
+            <w:tcW w:type="dxa" w:w="3061"/>
+          </w:tcPr>
+          <w:p>
+            <w:pPr>
+              <w:spacing w:after="20" w:line="276" w:lineRule="auto"/>
+            </w:pPr>
+            <w:r/>
+            <w:r>
+              <w:rPr>
+                <w:rFonts w:ascii="Microsoft YaHei" w:hAnsi="Microsoft YaHei" w:eastAsia="Microsoft YaHei"/>
+                <w:b w:val="0"/>
+                <w:color w:val="1A1A1A"/>
+                <w:sz w:val="19"/>
+              </w:rPr>
+              <w:t>成立专项项目组</w:t>
+            </w:r>
+          </w:p>
+        </w:tc>
+        <w:tc>
+          <w:tcPr>
+            <w:tcW w:type="dxa" w:w="5443"/>
+          </w:tcPr>
+          <w:p>
+            <w:pPr>
+              <w:spacing w:after="20" w:line="276" w:lineRule="auto"/>
+            </w:pPr>
+            <w:r/>
+            <w:r>
+              <w:rPr>
+                <w:rFonts w:ascii="Microsoft YaHei" w:hAnsi="Microsoft YaHei" w:eastAsia="Microsoft YaHei"/>
+                <w:b w:val="0"/>
+                <w:color w:val="1A1A1A"/>
+                <w:sz w:val="19"/>
+              </w:rPr>
+              <w:t>各方无时间参会，两个月后自然停摆</w:t>
+            </w:r>
+          </w:p>
+        </w:tc>
+      </w:tr>
+      <w:tr>
+        <w:tc>
+          <w:tcPr>
+            <w:tcW w:type="dxa" w:w="3061"/>
+          </w:tcPr>
+          <w:p>
+            <w:pPr>
+              <w:spacing w:after="20" w:line="276" w:lineRule="auto"/>
+            </w:pPr>
+            <w:r/>
+            <w:r>
+              <w:rPr>
+                <w:rFonts w:ascii="Microsoft YaHei" w:hAnsi="Microsoft YaHei" w:eastAsia="Microsoft YaHei"/>
+                <w:b w:val="0"/>
+                <w:color w:val="1A1A1A"/>
+                <w:sz w:val="19"/>
+              </w:rPr>
+              <w:t>下发表格开展调研</w:t>
+            </w:r>
+          </w:p>
+        </w:tc>
+        <w:tc>
+          <w:tcPr>
+            <w:tcW w:type="dxa" w:w="5443"/>
+          </w:tcPr>
+          <w:p>
+            <w:pPr>
+              <w:spacing w:after="20" w:line="276" w:lineRule="auto"/>
+            </w:pPr>
+            <w:r/>
+            <w:r>
+              <w:rPr>
+                <w:rFonts w:ascii="Microsoft YaHei" w:hAnsi="Microsoft YaHei" w:eastAsia="Microsoft YaHei"/>
+                <w:b w:val="0"/>
+                <w:color w:val="1A1A1A"/>
+                <w:sz w:val="19"/>
+              </w:rPr>
+              <w:t>填报质量差或不予返回，形不成有效结论</w:t>
+            </w:r>
+          </w:p>
+        </w:tc>
+      </w:tr>
+      <w:tr>
+        <w:tc>
+          <w:tcPr>
+            <w:tcW w:type="dxa" w:w="3061"/>
+          </w:tcPr>
+          <w:p>
+            <w:pPr>
+              <w:spacing w:after="20" w:line="276" w:lineRule="auto"/>
+            </w:pPr>
+            <w:r/>
+            <w:r>
+              <w:rPr>
+                <w:rFonts w:ascii="Microsoft YaHei" w:hAnsi="Microsoft YaHei" w:eastAsia="Microsoft YaHei"/>
+                <w:b w:val="0"/>
+                <w:color w:val="1A1A1A"/>
+                <w:sz w:val="19"/>
+              </w:rPr>
+              <w:t>先行立项招标</w:t>
+            </w:r>
+          </w:p>
+        </w:tc>
+        <w:tc>
+          <w:tcPr>
+            <w:tcW w:type="dxa" w:w="5443"/>
+          </w:tcPr>
+          <w:p>
+            <w:pPr>
+              <w:spacing w:after="20" w:line="276" w:lineRule="auto"/>
+            </w:pPr>
+            <w:r/>
+            <w:r>
+              <w:rPr>
+                <w:rFonts w:ascii="Microsoft YaHei" w:hAnsi="Microsoft YaHei" w:eastAsia="Microsoft YaHei"/>
+                <w:b w:val="0"/>
+                <w:color w:val="1A1A1A"/>
+                <w:sz w:val="19"/>
+              </w:rPr>
+              <w:t>采购周期长，业务侧在见到成果前已失去耐心</w:t>
+            </w:r>
+          </w:p>
+        </w:tc>
+      </w:tr>
+      <w:tr>
+        <w:tc>
+          <w:tcPr>
+            <w:tcW w:type="dxa" w:w="3061"/>
+          </w:tcPr>
+          <w:p>
+            <w:pPr>
+              <w:spacing w:after="20" w:line="276" w:lineRule="auto"/>
+            </w:pPr>
+            <w:r/>
+            <w:r>
+              <w:rPr>
+                <w:rFonts w:ascii="Microsoft YaHei" w:hAnsi="Microsoft YaHei" w:eastAsia="Microsoft YaHei"/>
+                <w:b w:val="0"/>
+                <w:color w:val="1A1A1A"/>
+                <w:sz w:val="19"/>
+              </w:rPr>
+              <w:t>先做大而全的整体规划</w:t>
+            </w:r>
+          </w:p>
+        </w:tc>
+        <w:tc>
+          <w:tcPr>
+            <w:tcW w:type="dxa" w:w="5443"/>
+          </w:tcPr>
+          <w:p>
+            <w:pPr>
+              <w:spacing w:after="20" w:line="276" w:lineRule="auto"/>
+            </w:pPr>
+            <w:r/>
+            <w:r>
+              <w:rPr>
+                <w:rFonts w:ascii="Microsoft YaHei" w:hAnsi="Microsoft YaHei" w:eastAsia="Microsoft YaHei"/>
+                <w:b w:val="0"/>
+                <w:color w:val="1A1A1A"/>
+                <w:sz w:val="19"/>
+              </w:rPr>
+              <w:t>管理层看不到实物，后续资源难以追加</w:t>
+            </w:r>
+          </w:p>
+        </w:tc>
+      </w:tr>
+      <w:tr>
+        <w:tc>
+          <w:tcPr>
+            <w:tcW w:type="dxa" w:w="3061"/>
+          </w:tcPr>
+          <w:p>
+            <w:pPr>
+              <w:spacing w:after="20" w:line="276" w:lineRule="auto"/>
+            </w:pPr>
+            <w:r/>
+            <w:r>
+              <w:rPr>
+                <w:rFonts w:ascii="Microsoft YaHei" w:hAnsi="Microsoft YaHei" w:eastAsia="Microsoft YaHei"/>
+                <w:b w:val="0"/>
+                <w:color w:val="1A1A1A"/>
+                <w:sz w:val="19"/>
+              </w:rPr>
+              <w:t>逐人逐事协商配合</w:t>
+            </w:r>
+          </w:p>
+        </w:tc>
+        <w:tc>
+          <w:tcPr>
+            <w:tcW w:type="dxa" w:w="5443"/>
+          </w:tcPr>
+          <w:p>
+            <w:pPr>
+              <w:spacing w:after="20" w:line="276" w:lineRule="auto"/>
+            </w:pPr>
+            <w:r/>
+            <w:r>
+              <w:rPr>
+                <w:rFonts w:ascii="Microsoft YaHei" w:hAnsi="Microsoft YaHei" w:eastAsia="Microsoft YaHei"/>
+                <w:b w:val="0"/>
+                <w:color w:val="1A1A1A"/>
+                <w:sz w:val="19"/>
+              </w:rPr>
+              <w:t>推进方被持续消耗，且不具备可持续性</w:t>
+            </w:r>
+          </w:p>
+        </w:tc>
+      </w:tr>
+    </w:tbl>
+    <w:p>
+      <w:pPr>
+        <w:spacing w:after="40"/>
+      </w:pPr>
+    </w:p>
+    <w:p>
+      <w:pPr>
+        <w:spacing w:before="280" w:after="100"/>
+      </w:pPr>
+      <w:r>
+        <w:rPr>
+          <w:rFonts w:ascii="Microsoft YaHei" w:hAnsi="Microsoft YaHei" w:eastAsia="Microsoft YaHei"/>
+          <w:b/>
+          <w:color w:val="000000"/>
+          <w:sz w:val="25"/>
+        </w:rPr>
+        <w:t>三、本方案的五条设计思路</w:t>
+      </w:r>
+    </w:p>
+    <w:p>
+      <w:pPr>
+        <w:spacing w:after="80" w:line="336" w:lineRule="auto"/>
+        <w:ind w:left="420"/>
+      </w:pPr>
+      <w:r>
+        <w:rPr>
+          <w:rFonts w:ascii="Microsoft YaHei" w:hAnsi="Microsoft YaHei" w:eastAsia="Microsoft YaHei"/>
+          <w:b/>
+          <w:color w:val="000000"/>
+          <w:sz w:val="21"/>
+        </w:rPr>
+        <w:t xml:space="preserve">1. </w:t>
+      </w:r>
+      <w:r>
+        <w:rPr>
+          <w:rFonts w:ascii="Microsoft YaHei" w:hAnsi="Microsoft YaHei" w:eastAsia="Microsoft YaHei"/>
+          <w:b/>
+          <w:color w:val="000000"/>
+          <w:sz w:val="21"/>
+        </w:rPr>
+        <w:t xml:space="preserve">机制先行　</w:t>
+      </w:r>
+      <w:r>
+        <w:rPr>
+          <w:rFonts w:ascii="Microsoft YaHei" w:hAnsi="Microsoft YaHei" w:eastAsia="Microsoft YaHei"/>
+          <w:b w:val="0"/>
+          <w:color w:val="1A1A1A"/>
+          <w:sz w:val="21"/>
+        </w:rPr>
+        <w:t>先取得固定汇报窗口、联络员名单与数据查询权限，再启动具体工作，使跨部门推进有稳定依托，不依赖临时协调。</w:t>
+      </w:r>
+    </w:p>
+    <w:p>
+      <w:pPr>
+        <w:spacing w:after="80" w:line="336" w:lineRule="auto"/>
+        <w:ind w:left="420"/>
+      </w:pPr>
+      <w:r>
+        <w:rPr>
+          <w:rFonts w:ascii="Microsoft YaHei" w:hAnsi="Microsoft YaHei" w:eastAsia="Microsoft YaHei"/>
+          <w:b/>
+          <w:color w:val="000000"/>
+          <w:sz w:val="21"/>
+        </w:rPr>
+        <w:t xml:space="preserve">2. </w:t>
+      </w:r>
+      <w:r>
+        <w:rPr>
+          <w:rFonts w:ascii="Microsoft YaHei" w:hAnsi="Microsoft YaHei" w:eastAsia="Microsoft YaHei"/>
+          <w:b/>
+          <w:color w:val="000000"/>
+          <w:sz w:val="21"/>
+        </w:rPr>
+        <w:t xml:space="preserve">零增量工时　</w:t>
+      </w:r>
+      <w:r>
+        <w:rPr>
+          <w:rFonts w:ascii="Microsoft YaHei" w:hAnsi="Microsoft YaHei" w:eastAsia="Microsoft YaHei"/>
+          <w:b w:val="0"/>
+          <w:color w:val="1A1A1A"/>
+          <w:sz w:val="21"/>
+        </w:rPr>
+        <w:t>AI 只嵌入既有流程，承担“先出草稿”或“先给提示”的辅助环节，不产生新任务、新记录、新会议，不改变现行操作与签字责任。</w:t>
+      </w:r>
+    </w:p>
+    <w:p>
+      <w:pPr>
+        <w:spacing w:after="80" w:line="336" w:lineRule="auto"/>
+        <w:ind w:left="420"/>
+      </w:pPr>
+      <w:r>
+        <w:rPr>
+          <w:rFonts w:ascii="Microsoft YaHei" w:hAnsi="Microsoft YaHei" w:eastAsia="Microsoft YaHei"/>
+          <w:b/>
+          <w:color w:val="000000"/>
+          <w:sz w:val="21"/>
+        </w:rPr>
+        <w:t xml:space="preserve">3. </w:t>
+      </w:r>
+      <w:r>
+        <w:rPr>
+          <w:rFonts w:ascii="Microsoft YaHei" w:hAnsi="Microsoft YaHei" w:eastAsia="Microsoft YaHei"/>
+          <w:b/>
+          <w:color w:val="000000"/>
+          <w:sz w:val="21"/>
+        </w:rPr>
+        <w:t xml:space="preserve">外部借力　</w:t>
+      </w:r>
+      <w:r>
+        <w:rPr>
+          <w:rFonts w:ascii="Microsoft YaHei" w:hAnsi="Microsoft YaHei" w:eastAsia="Microsoft YaHei"/>
+          <w:b w:val="0"/>
+          <w:color w:val="1A1A1A"/>
+          <w:sz w:val="21"/>
+        </w:rPr>
+        <w:t>利用供应商售前阶段资源完成技术能力探底与首轮验证，前期以技术交流方式开展，不进入采购流程、不发生费用。</w:t>
+      </w:r>
+    </w:p>
+    <w:p>
+      <w:pPr>
+        <w:spacing w:after="80" w:line="336" w:lineRule="auto"/>
+        <w:ind w:left="420"/>
+      </w:pPr>
+      <w:r>
+        <w:rPr>
+          <w:rFonts w:ascii="Microsoft YaHei" w:hAnsi="Microsoft YaHei" w:eastAsia="Microsoft YaHei"/>
+          <w:b/>
+          <w:color w:val="000000"/>
+          <w:sz w:val="21"/>
+        </w:rPr>
+        <w:t xml:space="preserve">4. </w:t>
+      </w:r>
+      <w:r>
+        <w:rPr>
+          <w:rFonts w:ascii="Microsoft YaHei" w:hAnsi="Microsoft YaHei" w:eastAsia="Microsoft YaHei"/>
+          <w:b/>
+          <w:color w:val="000000"/>
+          <w:sz w:val="21"/>
+        </w:rPr>
+        <w:t xml:space="preserve">可见性优先　</w:t>
+      </w:r>
+      <w:r>
+        <w:rPr>
+          <w:rFonts w:ascii="Microsoft YaHei" w:hAnsi="Microsoft YaHei" w:eastAsia="Microsoft YaHei"/>
+          <w:b w:val="0"/>
+          <w:color w:val="1A1A1A"/>
+          <w:sz w:val="21"/>
+        </w:rPr>
+        <w:t>按月形成可查看的阶段成果，宁要每月一个小实物，不做半年一份大报告，使推进状态与问题始终处于可掌握状态。</w:t>
+      </w:r>
+    </w:p>
+    <w:p>
+      <w:pPr>
+        <w:spacing w:after="80" w:line="336" w:lineRule="auto"/>
+        <w:ind w:left="420"/>
+      </w:pPr>
+      <w:r>
+        <w:rPr>
+          <w:rFonts w:ascii="Microsoft YaHei" w:hAnsi="Microsoft YaHei" w:eastAsia="Microsoft YaHei"/>
+          <w:b/>
+          <w:color w:val="000000"/>
+          <w:sz w:val="21"/>
+        </w:rPr>
+        <w:t xml:space="preserve">5. </w:t>
+      </w:r>
+      <w:r>
+        <w:rPr>
+          <w:rFonts w:ascii="Microsoft YaHei" w:hAnsi="Microsoft YaHei" w:eastAsia="Microsoft YaHei"/>
+          <w:b/>
+          <w:color w:val="000000"/>
+          <w:sz w:val="21"/>
+        </w:rPr>
+        <w:t xml:space="preserve">止损明确　</w:t>
+      </w:r>
+      <w:r>
+        <w:rPr>
+          <w:rFonts w:ascii="Microsoft YaHei" w:hAnsi="Microsoft YaHei" w:eastAsia="Microsoft YaHei"/>
+          <w:b w:val="0"/>
+          <w:color w:val="1A1A1A"/>
+          <w:sz w:val="21"/>
+        </w:rPr>
+        <w:t>每个场景事前设定退出条件，连续无实质进展即调整方向，不在已判定不可行的场景上持续投入。</w:t>
       </w:r>
     </w:p>
     <w:p>
@@ -161,7 +625,1468 @@
           <w:color w:val="000000"/>
           <w:sz w:val="25"/>
         </w:rPr>
-        <w:t>二、建议事项</w:t>
+        <w:t>四、具体方案与阶段产出</w:t>
+      </w:r>
+    </w:p>
+    <w:p>
+      <w:pPr>
+        <w:ind w:firstLine="420"/>
+      </w:pPr>
+      <w:r>
+        <w:rPr>
+          <w:rFonts w:ascii="Microsoft YaHei" w:hAnsi="Microsoft YaHei" w:eastAsia="Microsoft YaHei"/>
+          <w:b w:val="0"/>
+          <w:color w:val="1A1A1A"/>
+          <w:sz w:val="22"/>
+        </w:rPr>
+        <w:t>整体分五个阶段推进，前两个阶段不发生费用，自试点阶段起按实际范围另行请示所需投入。</w:t>
+      </w:r>
+    </w:p>
+    <w:p>
+      <w:pPr>
+        <w:spacing w:before="220" w:after="60"/>
+        <w:ind w:left="420"/>
+      </w:pPr>
+      <w:r>
+        <w:rPr>
+          <w:rFonts w:ascii="Microsoft YaHei" w:hAnsi="Microsoft YaHei" w:eastAsia="Microsoft YaHei"/>
+          <w:b/>
+          <w:color w:val="000000"/>
+          <w:sz w:val="23"/>
+        </w:rPr>
+        <w:t>阶段一　场景摸底与数据条件评估</w:t>
+      </w:r>
+      <w:r>
+        <w:rPr>
+          <w:rFonts w:ascii="Microsoft YaHei" w:hAnsi="Microsoft YaHei" w:eastAsia="Microsoft YaHei"/>
+          <w:b w:val="0"/>
+          <w:color w:val="595959"/>
+          <w:sz w:val="20"/>
+        </w:rPr>
+        <w:t>（第 1–2 个月）</w:t>
+      </w:r>
+    </w:p>
+    <w:p>
+      <w:pPr>
+        <w:spacing w:after="40"/>
+        <w:ind w:left="624"/>
+      </w:pPr>
+      <w:r>
+        <w:rPr>
+          <w:rFonts w:ascii="Microsoft YaHei" w:hAnsi="Microsoft YaHei" w:eastAsia="Microsoft YaHei"/>
+          <w:b/>
+          <w:color w:val="595959"/>
+          <w:sz w:val="21"/>
+        </w:rPr>
+        <w:t>主要工作</w:t>
+      </w:r>
+    </w:p>
+    <w:p>
+      <w:pPr>
+        <w:spacing w:after="60" w:line="324" w:lineRule="auto"/>
+        <w:ind w:left="850"/>
+      </w:pPr>
+      <w:r>
+        <w:rPr>
+          <w:rFonts w:ascii="Microsoft YaHei" w:hAnsi="Microsoft YaHei" w:eastAsia="Microsoft YaHei"/>
+          <w:b w:val="0"/>
+          <w:color w:val="1A1A1A"/>
+          <w:sz w:val="21"/>
+        </w:rPr>
+        <w:t>— 以一对一现场访谈方式覆盖生产车间及工艺、设备、质量、生产计划等岗位，计 15–20 人次</w:t>
+      </w:r>
+    </w:p>
+    <w:p>
+      <w:pPr>
+        <w:spacing w:after="60" w:line="324" w:lineRule="auto"/>
+        <w:ind w:left="850"/>
+      </w:pPr>
+      <w:r>
+        <w:rPr>
+          <w:rFonts w:ascii="Microsoft YaHei" w:hAnsi="Microsoft YaHei" w:eastAsia="Microsoft YaHei"/>
+          <w:b w:val="0"/>
+          <w:color w:val="1A1A1A"/>
+          <w:sz w:val="21"/>
+        </w:rPr>
+        <w:t>— 访谈聚焦具体重复性工作的发生频次、单次耗时与承担岗位，不做概念征询，确保结论可核算</w:t>
+      </w:r>
+    </w:p>
+    <w:p>
+      <w:pPr>
+        <w:spacing w:after="60" w:line="324" w:lineRule="auto"/>
+        <w:ind w:left="850"/>
+      </w:pPr>
+      <w:r>
+        <w:rPr>
+          <w:rFonts w:ascii="Microsoft YaHei" w:hAnsi="Microsoft YaHei" w:eastAsia="Microsoft YaHei"/>
+          <w:b w:val="0"/>
+          <w:color w:val="1A1A1A"/>
+          <w:sz w:val="21"/>
+        </w:rPr>
+        <w:t>— 逐系统评估数据可用条件：接口是否具备、历史数据深度、字段完整度、权限开通方式</w:t>
+      </w:r>
+    </w:p>
+    <w:p>
+      <w:pPr>
+        <w:spacing w:after="60" w:line="324" w:lineRule="auto"/>
+        <w:ind w:left="850"/>
+      </w:pPr>
+      <w:r>
+        <w:rPr>
+          <w:rFonts w:ascii="Microsoft YaHei" w:hAnsi="Microsoft YaHei" w:eastAsia="Microsoft YaHei"/>
+          <w:b w:val="0"/>
+          <w:color w:val="1A1A1A"/>
+          <w:sz w:val="21"/>
+        </w:rPr>
+        <w:t>— 对涉及客户信息的场景，同步明确脱敏与留痕要求</w:t>
+      </w:r>
+    </w:p>
+    <w:p>
+      <w:pPr>
+        <w:spacing w:before="80" w:after="40"/>
+        <w:ind w:left="624"/>
+      </w:pPr>
+      <w:r>
+        <w:rPr>
+          <w:rFonts w:ascii="Microsoft YaHei" w:hAnsi="Microsoft YaHei" w:eastAsia="Microsoft YaHei"/>
+          <w:b/>
+          <w:color w:val="595959"/>
+          <w:sz w:val="21"/>
+        </w:rPr>
+        <w:t>阶段产出</w:t>
+      </w:r>
+    </w:p>
+    <w:p>
+      <w:pPr>
+        <w:spacing w:after="60" w:line="324" w:lineRule="auto"/>
+        <w:ind w:left="850"/>
+      </w:pPr>
+      <w:r>
+        <w:rPr>
+          <w:rFonts w:ascii="Microsoft YaHei" w:hAnsi="Microsoft YaHei" w:eastAsia="Microsoft YaHei"/>
+          <w:b w:val="0"/>
+          <w:color w:val="1A1A1A"/>
+          <w:sz w:val="21"/>
+        </w:rPr>
+        <w:t>— 生产场景清单，按年度占用工时排序</w:t>
+      </w:r>
+    </w:p>
+    <w:p>
+      <w:pPr>
+        <w:spacing w:after="60" w:line="324" w:lineRule="auto"/>
+        <w:ind w:left="850"/>
+      </w:pPr>
+      <w:r>
+        <w:rPr>
+          <w:rFonts w:ascii="Microsoft YaHei" w:hAnsi="Microsoft YaHei" w:eastAsia="Microsoft YaHei"/>
+          <w:b w:val="0"/>
+          <w:color w:val="1A1A1A"/>
+          <w:sz w:val="21"/>
+        </w:rPr>
+        <w:t>— 数据就绪度评估表，分“可直接取用 / 需开发但可行 / 暂不具备”三档</w:t>
+      </w:r>
+    </w:p>
+    <w:p>
+      <w:pPr>
+        <w:spacing w:after="60" w:line="324" w:lineRule="auto"/>
+        <w:ind w:left="850"/>
+      </w:pPr>
+      <w:r>
+        <w:rPr>
+          <w:rFonts w:ascii="Microsoft YaHei" w:hAnsi="Microsoft YaHei" w:eastAsia="Microsoft YaHei"/>
+          <w:b w:val="0"/>
+          <w:color w:val="1A1A1A"/>
+          <w:sz w:val="21"/>
+        </w:rPr>
+        <w:t>— 首批可行场景候选 3–5 个，并说明排除其余场景的理由</w:t>
+      </w:r>
+    </w:p>
+    <w:p>
+      <w:pPr>
+        <w:spacing w:before="220" w:after="60"/>
+        <w:ind w:left="420"/>
+      </w:pPr>
+      <w:r>
+        <w:rPr>
+          <w:rFonts w:ascii="Microsoft YaHei" w:hAnsi="Microsoft YaHei" w:eastAsia="Microsoft YaHei"/>
+          <w:b/>
+          <w:color w:val="000000"/>
+          <w:sz w:val="23"/>
+        </w:rPr>
+        <w:t>阶段二　外部技术能力探底</w:t>
+      </w:r>
+      <w:r>
+        <w:rPr>
+          <w:rFonts w:ascii="Microsoft YaHei" w:hAnsi="Microsoft YaHei" w:eastAsia="Microsoft YaHei"/>
+          <w:b w:val="0"/>
+          <w:color w:val="595959"/>
+          <w:sz w:val="20"/>
+        </w:rPr>
+        <w:t>（第 3–4 个月）</w:t>
+      </w:r>
+    </w:p>
+    <w:p>
+      <w:pPr>
+        <w:spacing w:after="40"/>
+        <w:ind w:left="624"/>
+      </w:pPr>
+      <w:r>
+        <w:rPr>
+          <w:rFonts w:ascii="Microsoft YaHei" w:hAnsi="Microsoft YaHei" w:eastAsia="Microsoft YaHei"/>
+          <w:b/>
+          <w:color w:val="595959"/>
+          <w:sz w:val="21"/>
+        </w:rPr>
+        <w:t>主要工作</w:t>
+      </w:r>
+    </w:p>
+    <w:p>
+      <w:pPr>
+        <w:spacing w:after="60" w:line="324" w:lineRule="auto"/>
+        <w:ind w:left="850"/>
+      </w:pPr>
+      <w:r>
+        <w:rPr>
+          <w:rFonts w:ascii="Microsoft YaHei" w:hAnsi="Microsoft YaHei" w:eastAsia="Microsoft YaHei"/>
+          <w:b w:val="0"/>
+          <w:color w:val="1A1A1A"/>
+          <w:sz w:val="21"/>
+        </w:rPr>
+        <w:t>— 按场景方向分类接触国内代表性厂商，每类 3–5 家，覆盖视觉巡检、设备点检与预测性维护、生产数据分析、报告与知识类模型应用等方向</w:t>
+      </w:r>
+    </w:p>
+    <w:p>
+      <w:pPr>
+        <w:spacing w:after="60" w:line="324" w:lineRule="auto"/>
+        <w:ind w:left="850"/>
+      </w:pPr>
+      <w:r>
+        <w:rPr>
+          <w:rFonts w:ascii="Microsoft YaHei" w:hAnsi="Microsoft YaHei" w:eastAsia="Microsoft YaHei"/>
+          <w:b w:val="0"/>
+          <w:color w:val="1A1A1A"/>
+          <w:sz w:val="21"/>
+        </w:rPr>
+        <w:t>— 统一发出场景需求说明，要求书面答复四项：制药或化工同类可核实案例、所需数据范围与格式、从启动到见效的最短周期、可否开展小范围验证</w:t>
+      </w:r>
+    </w:p>
+    <w:p>
+      <w:pPr>
+        <w:spacing w:after="60" w:line="324" w:lineRule="auto"/>
+        <w:ind w:left="850"/>
+      </w:pPr>
+      <w:r>
+        <w:rPr>
+          <w:rFonts w:ascii="Microsoft YaHei" w:hAnsi="Microsoft YaHei" w:eastAsia="Microsoft YaHei"/>
+          <w:b w:val="0"/>
+          <w:color w:val="1A1A1A"/>
+          <w:sz w:val="21"/>
+        </w:rPr>
+        <w:t>— 组织一次集中技术交流，同日安排多家宣讲，形成横向可比信息</w:t>
+      </w:r>
+    </w:p>
+    <w:p>
+      <w:pPr>
+        <w:spacing w:after="60" w:line="324" w:lineRule="auto"/>
+        <w:ind w:left="850"/>
+      </w:pPr>
+      <w:r>
+        <w:rPr>
+          <w:rFonts w:ascii="Microsoft YaHei" w:hAnsi="Microsoft YaHei" w:eastAsia="Microsoft YaHei"/>
+          <w:b w:val="0"/>
+          <w:color w:val="1A1A1A"/>
+          <w:sz w:val="21"/>
+        </w:rPr>
+        <w:t>— 全过程定位为技术交流与信息收集，不承诺采购、不进入招标流程；对外材料仅描述业务问题，不涉及工艺参数与客户信息</w:t>
+      </w:r>
+    </w:p>
+    <w:p>
+      <w:pPr>
+        <w:spacing w:before="80" w:after="40"/>
+        <w:ind w:left="624"/>
+      </w:pPr>
+      <w:r>
+        <w:rPr>
+          <w:rFonts w:ascii="Microsoft YaHei" w:hAnsi="Microsoft YaHei" w:eastAsia="Microsoft YaHei"/>
+          <w:b/>
+          <w:color w:val="595959"/>
+          <w:sz w:val="21"/>
+        </w:rPr>
+        <w:t>阶段产出</w:t>
+      </w:r>
+    </w:p>
+    <w:p>
+      <w:pPr>
+        <w:spacing w:after="60" w:line="324" w:lineRule="auto"/>
+        <w:ind w:left="850"/>
+      </w:pPr>
+      <w:r>
+        <w:rPr>
+          <w:rFonts w:ascii="Microsoft YaHei" w:hAnsi="Microsoft YaHei" w:eastAsia="Microsoft YaHei"/>
+          <w:b w:val="0"/>
+          <w:color w:val="1A1A1A"/>
+          <w:sz w:val="21"/>
+        </w:rPr>
+        <w:t>— 供应商能力对比表，含案例真实性、数据要求、实施周期、报价区间与技术绑定风险</w:t>
+      </w:r>
+    </w:p>
+    <w:p>
+      <w:pPr>
+        <w:spacing w:after="60" w:line="324" w:lineRule="auto"/>
+        <w:ind w:left="850"/>
+      </w:pPr>
+      <w:r>
+        <w:rPr>
+          <w:rFonts w:ascii="Microsoft YaHei" w:hAnsi="Microsoft YaHei" w:eastAsia="Microsoft YaHei"/>
+          <w:b w:val="0"/>
+          <w:color w:val="1A1A1A"/>
+          <w:sz w:val="21"/>
+        </w:rPr>
+        <w:t>— 数据要求清单，用于反向校核阶段一的数据评估结论</w:t>
+      </w:r>
+    </w:p>
+    <w:p>
+      <w:pPr>
+        <w:spacing w:after="60" w:line="324" w:lineRule="auto"/>
+        <w:ind w:left="850"/>
+      </w:pPr>
+      <w:r>
+        <w:rPr>
+          <w:rFonts w:ascii="Microsoft YaHei" w:hAnsi="Microsoft YaHei" w:eastAsia="Microsoft YaHei"/>
+          <w:b w:val="0"/>
+          <w:color w:val="1A1A1A"/>
+          <w:sz w:val="21"/>
+        </w:rPr>
+        <w:t>— 自建与外采的边界建议，避免后续形成单一供应商依赖</w:t>
+      </w:r>
+    </w:p>
+    <w:p>
+      <w:pPr>
+        <w:spacing w:before="220" w:after="60"/>
+        <w:ind w:left="420"/>
+      </w:pPr>
+      <w:r>
+        <w:rPr>
+          <w:rFonts w:ascii="Microsoft YaHei" w:hAnsi="Microsoft YaHei" w:eastAsia="Microsoft YaHei"/>
+          <w:b/>
+          <w:color w:val="000000"/>
+          <w:sz w:val="23"/>
+        </w:rPr>
+        <w:t>阶段三　小范围试点</w:t>
+      </w:r>
+      <w:r>
+        <w:rPr>
+          <w:rFonts w:ascii="Microsoft YaHei" w:hAnsi="Microsoft YaHei" w:eastAsia="Microsoft YaHei"/>
+          <w:b w:val="0"/>
+          <w:color w:val="595959"/>
+          <w:sz w:val="20"/>
+        </w:rPr>
+        <w:t>（第 5–9 个月）</w:t>
+      </w:r>
+    </w:p>
+    <w:p>
+      <w:pPr>
+        <w:spacing w:after="40"/>
+        <w:ind w:left="624"/>
+      </w:pPr>
+      <w:r>
+        <w:rPr>
+          <w:rFonts w:ascii="Microsoft YaHei" w:hAnsi="Microsoft YaHei" w:eastAsia="Microsoft YaHei"/>
+          <w:b/>
+          <w:color w:val="595959"/>
+          <w:sz w:val="21"/>
+        </w:rPr>
+        <w:t>主要工作</w:t>
+      </w:r>
+    </w:p>
+    <w:p>
+      <w:pPr>
+        <w:spacing w:after="60" w:line="324" w:lineRule="auto"/>
+        <w:ind w:left="850"/>
+      </w:pPr>
+      <w:r>
+        <w:rPr>
+          <w:rFonts w:ascii="Microsoft YaHei" w:hAnsi="Microsoft YaHei" w:eastAsia="Microsoft YaHei"/>
+          <w:b w:val="0"/>
+          <w:color w:val="1A1A1A"/>
+          <w:sz w:val="21"/>
+        </w:rPr>
+        <w:t>— 从候选场景中选取两个：一个流程标准化程度高、见效较快；一个业务价值明显且可控性强</w:t>
+      </w:r>
+    </w:p>
+    <w:p>
+      <w:pPr>
+        <w:spacing w:after="60" w:line="324" w:lineRule="auto"/>
+        <w:ind w:left="850"/>
+      </w:pPr>
+      <w:r>
+        <w:rPr>
+          <w:rFonts w:ascii="Microsoft YaHei" w:hAnsi="Microsoft YaHei" w:eastAsia="Microsoft YaHei"/>
+          <w:b w:val="0"/>
+          <w:color w:val="1A1A1A"/>
+          <w:sz w:val="21"/>
+        </w:rPr>
+        <w:t>— 入选场景须同时满足三项条件：数据条件已具备、三个月内可产出实物、失败不影响合规与生产交付</w:t>
+      </w:r>
+    </w:p>
+    <w:p>
+      <w:pPr>
+        <w:spacing w:after="60" w:line="324" w:lineRule="auto"/>
+        <w:ind w:left="850"/>
+      </w:pPr>
+      <w:r>
+        <w:rPr>
+          <w:rFonts w:ascii="Microsoft YaHei" w:hAnsi="Microsoft YaHei" w:eastAsia="Microsoft YaHei"/>
+          <w:b w:val="0"/>
+          <w:color w:val="1A1A1A"/>
+          <w:sz w:val="21"/>
+        </w:rPr>
+        <w:t>— AI 输出一律作为草稿或提示，由岗位人员判断确认，现行审核与签字责任不作调整</w:t>
+      </w:r>
+    </w:p>
+    <w:p>
+      <w:pPr>
+        <w:spacing w:after="60" w:line="324" w:lineRule="auto"/>
+        <w:ind w:left="850"/>
+      </w:pPr>
+      <w:r>
+        <w:rPr>
+          <w:rFonts w:ascii="Microsoft YaHei" w:hAnsi="Microsoft YaHei" w:eastAsia="Microsoft YaHei"/>
+          <w:b w:val="0"/>
+          <w:color w:val="1A1A1A"/>
+          <w:sz w:val="21"/>
+        </w:rPr>
+        <w:t>— 建立结果反馈与错误样本回收机制，作为迭代依据</w:t>
+      </w:r>
+    </w:p>
+    <w:p>
+      <w:pPr>
+        <w:spacing w:after="60" w:line="324" w:lineRule="auto"/>
+        <w:ind w:left="850"/>
+      </w:pPr>
+      <w:r>
+        <w:rPr>
+          <w:rFonts w:ascii="Microsoft YaHei" w:hAnsi="Microsoft YaHei" w:eastAsia="Microsoft YaHei"/>
+          <w:b w:val="0"/>
+          <w:color w:val="1A1A1A"/>
+          <w:sz w:val="21"/>
+        </w:rPr>
+        <w:t>— 试点期间同步记录使用频次、输出可用率与人工修正比例</w:t>
+      </w:r>
+    </w:p>
+    <w:p>
+      <w:pPr>
+        <w:spacing w:before="80" w:after="40"/>
+        <w:ind w:left="624"/>
+      </w:pPr>
+      <w:r>
+        <w:rPr>
+          <w:rFonts w:ascii="Microsoft YaHei" w:hAnsi="Microsoft YaHei" w:eastAsia="Microsoft YaHei"/>
+          <w:b/>
+          <w:color w:val="595959"/>
+          <w:sz w:val="21"/>
+        </w:rPr>
+        <w:t>阶段产出</w:t>
+      </w:r>
+    </w:p>
+    <w:p>
+      <w:pPr>
+        <w:spacing w:after="60" w:line="324" w:lineRule="auto"/>
+        <w:ind w:left="850"/>
+      </w:pPr>
+      <w:r>
+        <w:rPr>
+          <w:rFonts w:ascii="Microsoft YaHei" w:hAnsi="Microsoft YaHei" w:eastAsia="Microsoft YaHei"/>
+          <w:b w:val="0"/>
+          <w:color w:val="1A1A1A"/>
+          <w:sz w:val="21"/>
+        </w:rPr>
+        <w:t>— 两个可实际演示的应用，含真实输出样张</w:t>
+      </w:r>
+    </w:p>
+    <w:p>
+      <w:pPr>
+        <w:spacing w:after="60" w:line="324" w:lineRule="auto"/>
+        <w:ind w:left="850"/>
+      </w:pPr>
+      <w:r>
+        <w:rPr>
+          <w:rFonts w:ascii="Microsoft YaHei" w:hAnsi="Microsoft YaHei" w:eastAsia="Microsoft YaHei"/>
+          <w:b w:val="0"/>
+          <w:color w:val="1A1A1A"/>
+          <w:sz w:val="21"/>
+        </w:rPr>
+        <w:t>— 使用记录与问题清单</w:t>
+      </w:r>
+    </w:p>
+    <w:p>
+      <w:pPr>
+        <w:spacing w:after="60" w:line="324" w:lineRule="auto"/>
+        <w:ind w:left="850"/>
+      </w:pPr>
+      <w:r>
+        <w:rPr>
+          <w:rFonts w:ascii="Microsoft YaHei" w:hAnsi="Microsoft YaHei" w:eastAsia="Microsoft YaHei"/>
+          <w:b w:val="0"/>
+          <w:color w:val="1A1A1A"/>
+          <w:sz w:val="21"/>
+        </w:rPr>
+        <w:t>— 试点结论及是否扩展的建议</w:t>
+      </w:r>
+    </w:p>
+    <w:p>
+      <w:pPr>
+        <w:spacing w:before="220" w:after="60"/>
+        <w:ind w:left="420"/>
+      </w:pPr>
+      <w:r>
+        <w:rPr>
+          <w:rFonts w:ascii="Microsoft YaHei" w:hAnsi="Microsoft YaHei" w:eastAsia="Microsoft YaHei"/>
+          <w:b/>
+          <w:color w:val="000000"/>
+          <w:sz w:val="23"/>
+        </w:rPr>
+        <w:t>阶段四　效果量化</w:t>
+      </w:r>
+      <w:r>
+        <w:rPr>
+          <w:rFonts w:ascii="Microsoft YaHei" w:hAnsi="Microsoft YaHei" w:eastAsia="Microsoft YaHei"/>
+          <w:b w:val="0"/>
+          <w:color w:val="595959"/>
+          <w:sz w:val="20"/>
+        </w:rPr>
+        <w:t>（第 9–10 个月）</w:t>
+      </w:r>
+    </w:p>
+    <w:p>
+      <w:pPr>
+        <w:spacing w:after="40"/>
+        <w:ind w:left="624"/>
+      </w:pPr>
+      <w:r>
+        <w:rPr>
+          <w:rFonts w:ascii="Microsoft YaHei" w:hAnsi="Microsoft YaHei" w:eastAsia="Microsoft YaHei"/>
+          <w:b/>
+          <w:color w:val="595959"/>
+          <w:sz w:val="21"/>
+        </w:rPr>
+        <w:t>主要工作</w:t>
+      </w:r>
+    </w:p>
+    <w:p>
+      <w:pPr>
+        <w:spacing w:after="60" w:line="324" w:lineRule="auto"/>
+        <w:ind w:left="850"/>
+      </w:pPr>
+      <w:r>
+        <w:rPr>
+          <w:rFonts w:ascii="Microsoft YaHei" w:hAnsi="Microsoft YaHei" w:eastAsia="Microsoft YaHei"/>
+          <w:b w:val="0"/>
+          <w:color w:val="1A1A1A"/>
+          <w:sz w:val="21"/>
+        </w:rPr>
+        <w:t>— 采用同一工作内容在试点前后的耗时对比口径，取多个真实样本核算，结果可复算</w:t>
+      </w:r>
+    </w:p>
+    <w:p>
+      <w:pPr>
+        <w:spacing w:after="60" w:line="324" w:lineRule="auto"/>
+        <w:ind w:left="850"/>
+      </w:pPr>
+      <w:r>
+        <w:rPr>
+          <w:rFonts w:ascii="Microsoft YaHei" w:hAnsi="Microsoft YaHei" w:eastAsia="Microsoft YaHei"/>
+          <w:b w:val="0"/>
+          <w:color w:val="1A1A1A"/>
+          <w:sz w:val="21"/>
+        </w:rPr>
+        <w:t>— 结合使用频次、输出可用率、人工修正比例综合判断实际效果</w:t>
+      </w:r>
+    </w:p>
+    <w:p>
+      <w:pPr>
+        <w:spacing w:after="60" w:line="324" w:lineRule="auto"/>
+        <w:ind w:left="850"/>
+      </w:pPr>
+      <w:r>
+        <w:rPr>
+          <w:rFonts w:ascii="Microsoft YaHei" w:hAnsi="Microsoft YaHei" w:eastAsia="Microsoft YaHei"/>
+          <w:b w:val="0"/>
+          <w:color w:val="1A1A1A"/>
+          <w:sz w:val="21"/>
+        </w:rPr>
+        <w:t>— 一并说明未达预期的部分及原因，不作选择性呈现</w:t>
+      </w:r>
+    </w:p>
+    <w:p>
+      <w:pPr>
+        <w:spacing w:before="80" w:after="40"/>
+        <w:ind w:left="624"/>
+      </w:pPr>
+      <w:r>
+        <w:rPr>
+          <w:rFonts w:ascii="Microsoft YaHei" w:hAnsi="Microsoft YaHei" w:eastAsia="Microsoft YaHei"/>
+          <w:b/>
+          <w:color w:val="595959"/>
+          <w:sz w:val="21"/>
+        </w:rPr>
+        <w:t>阶段产出</w:t>
+      </w:r>
+    </w:p>
+    <w:p>
+      <w:pPr>
+        <w:spacing w:after="60" w:line="324" w:lineRule="auto"/>
+        <w:ind w:left="850"/>
+      </w:pPr>
+      <w:r>
+        <w:rPr>
+          <w:rFonts w:ascii="Microsoft YaHei" w:hAnsi="Microsoft YaHei" w:eastAsia="Microsoft YaHei"/>
+          <w:b w:val="0"/>
+          <w:color w:val="1A1A1A"/>
+          <w:sz w:val="21"/>
+        </w:rPr>
+        <w:t>— 效果量化报告，数据可核实、可复算</w:t>
+      </w:r>
+    </w:p>
+    <w:p>
+      <w:pPr>
+        <w:spacing w:after="60" w:line="324" w:lineRule="auto"/>
+        <w:ind w:left="850"/>
+      </w:pPr>
+      <w:r>
+        <w:rPr>
+          <w:rFonts w:ascii="Microsoft YaHei" w:hAnsi="Microsoft YaHei" w:eastAsia="Microsoft YaHei"/>
+          <w:b w:val="0"/>
+          <w:color w:val="1A1A1A"/>
+          <w:sz w:val="21"/>
+        </w:rPr>
+        <w:t>— 下一阶段扩展范围与投入申请</w:t>
+      </w:r>
+    </w:p>
+    <w:p>
+      <w:pPr>
+        <w:spacing w:before="220" w:after="60"/>
+        <w:ind w:left="420"/>
+      </w:pPr>
+      <w:r>
+        <w:rPr>
+          <w:rFonts w:ascii="Microsoft YaHei" w:hAnsi="Microsoft YaHei" w:eastAsia="Microsoft YaHei"/>
+          <w:b/>
+          <w:color w:val="000000"/>
+          <w:sz w:val="23"/>
+        </w:rPr>
+        <w:t>阶段五　固化与扩散</w:t>
+      </w:r>
+      <w:r>
+        <w:rPr>
+          <w:rFonts w:ascii="Microsoft YaHei" w:hAnsi="Microsoft YaHei" w:eastAsia="Microsoft YaHei"/>
+          <w:b w:val="0"/>
+          <w:color w:val="595959"/>
+          <w:sz w:val="20"/>
+        </w:rPr>
+        <w:t>（第 10–18 个月）</w:t>
+      </w:r>
+    </w:p>
+    <w:p>
+      <w:pPr>
+        <w:spacing w:after="40"/>
+        <w:ind w:left="624"/>
+      </w:pPr>
+      <w:r>
+        <w:rPr>
+          <w:rFonts w:ascii="Microsoft YaHei" w:hAnsi="Microsoft YaHei" w:eastAsia="Microsoft YaHei"/>
+          <w:b/>
+          <w:color w:val="595959"/>
+          <w:sz w:val="21"/>
+        </w:rPr>
+        <w:t>主要工作</w:t>
+      </w:r>
+    </w:p>
+    <w:p>
+      <w:pPr>
+        <w:spacing w:after="60" w:line="324" w:lineRule="auto"/>
+        <w:ind w:left="850"/>
+      </w:pPr>
+      <w:r>
+        <w:rPr>
+          <w:rFonts w:ascii="Microsoft YaHei" w:hAnsi="Microsoft YaHei" w:eastAsia="Microsoft YaHei"/>
+          <w:b w:val="0"/>
+          <w:color w:val="1A1A1A"/>
+          <w:sz w:val="21"/>
+        </w:rPr>
+        <w:t>— 将验证有效的操作写入现有作业文件，使 AI 环节成为流程组成部分而非附加事项</w:t>
+      </w:r>
+    </w:p>
+    <w:p>
+      <w:pPr>
+        <w:spacing w:after="60" w:line="324" w:lineRule="auto"/>
+        <w:ind w:left="850"/>
+      </w:pPr>
+      <w:r>
+        <w:rPr>
+          <w:rFonts w:ascii="Microsoft YaHei" w:hAnsi="Microsoft YaHei" w:eastAsia="Microsoft YaHei"/>
+          <w:b w:val="0"/>
+          <w:color w:val="1A1A1A"/>
+          <w:sz w:val="21"/>
+        </w:rPr>
+        <w:t>— 制作短时长培训内容并嵌入现有培训体系，不单独占用班次</w:t>
+      </w:r>
+    </w:p>
+    <w:p>
+      <w:pPr>
+        <w:spacing w:after="60" w:line="324" w:lineRule="auto"/>
+        <w:ind w:left="850"/>
+      </w:pPr>
+      <w:r>
+        <w:rPr>
+          <w:rFonts w:ascii="Microsoft YaHei" w:hAnsi="Microsoft YaHei" w:eastAsia="Microsoft YaHei"/>
+          <w:b w:val="0"/>
+          <w:color w:val="1A1A1A"/>
+          <w:sz w:val="21"/>
+        </w:rPr>
+        <w:t>— 将工具使用与结果反馈纳入相关岗位职责说明，减少对推进方的依赖</w:t>
+      </w:r>
+    </w:p>
+    <w:p>
+      <w:pPr>
+        <w:spacing w:after="60" w:line="324" w:lineRule="auto"/>
+        <w:ind w:left="850"/>
+      </w:pPr>
+      <w:r>
+        <w:rPr>
+          <w:rFonts w:ascii="Microsoft YaHei" w:hAnsi="Microsoft YaHei" w:eastAsia="Microsoft YaHei"/>
+          <w:b w:val="0"/>
+          <w:color w:val="1A1A1A"/>
+          <w:sz w:val="21"/>
+        </w:rPr>
+        <w:t>— 各车间培养 1 名联络员，承担日常使用指导与问题收集</w:t>
+      </w:r>
+    </w:p>
+    <w:p>
+      <w:pPr>
+        <w:spacing w:before="80" w:after="40"/>
+        <w:ind w:left="624"/>
+      </w:pPr>
+      <w:r>
+        <w:rPr>
+          <w:rFonts w:ascii="Microsoft YaHei" w:hAnsi="Microsoft YaHei" w:eastAsia="Microsoft YaHei"/>
+          <w:b/>
+          <w:color w:val="595959"/>
+          <w:sz w:val="21"/>
+        </w:rPr>
+        <w:t>阶段产出</w:t>
+      </w:r>
+    </w:p>
+    <w:p>
+      <w:pPr>
+        <w:spacing w:after="60" w:line="324" w:lineRule="auto"/>
+        <w:ind w:left="850"/>
+      </w:pPr>
+      <w:r>
+        <w:rPr>
+          <w:rFonts w:ascii="Microsoft YaHei" w:hAnsi="Microsoft YaHei" w:eastAsia="Microsoft YaHei"/>
+          <w:b w:val="0"/>
+          <w:color w:val="1A1A1A"/>
+          <w:sz w:val="21"/>
+        </w:rPr>
+        <w:t>— 相关作业文件与培训材料</w:t>
+      </w:r>
+    </w:p>
+    <w:p>
+      <w:pPr>
+        <w:spacing w:after="60" w:line="324" w:lineRule="auto"/>
+        <w:ind w:left="850"/>
+      </w:pPr>
+      <w:r>
+        <w:rPr>
+          <w:rFonts w:ascii="Microsoft YaHei" w:hAnsi="Microsoft YaHei" w:eastAsia="Microsoft YaHei"/>
+          <w:b w:val="0"/>
+          <w:color w:val="1A1A1A"/>
+          <w:sz w:val="21"/>
+        </w:rPr>
+        <w:t>— 可复制场景清单，含适用条件、所需前提与预计周期</w:t>
+      </w:r>
+    </w:p>
+    <w:p>
+      <w:pPr>
+        <w:spacing w:after="60" w:line="324" w:lineRule="auto"/>
+        <w:ind w:left="850"/>
+      </w:pPr>
+      <w:r>
+        <w:rPr>
+          <w:rFonts w:ascii="Microsoft YaHei" w:hAnsi="Microsoft YaHei" w:eastAsia="Microsoft YaHei"/>
+          <w:b w:val="0"/>
+          <w:color w:val="1A1A1A"/>
+          <w:sz w:val="21"/>
+        </w:rPr>
+        <w:t>— 具备向其他厂区推广的条件</w:t>
+      </w:r>
+    </w:p>
+    <w:p>
+      <w:pPr>
+        <w:spacing w:before="280" w:after="100"/>
+      </w:pPr>
+      <w:r>
+        <w:rPr>
+          <w:rFonts w:ascii="Microsoft YaHei" w:hAnsi="Microsoft YaHei" w:eastAsia="Microsoft YaHei"/>
+          <w:b/>
+          <w:color w:val="000000"/>
+          <w:sz w:val="25"/>
+        </w:rPr>
+        <w:t>五、分层收益</w:t>
+      </w:r>
+    </w:p>
+    <w:p>
+      <w:pPr>
+        <w:ind w:firstLine="420"/>
+      </w:pPr>
+      <w:r>
+        <w:rPr>
+          <w:rFonts w:ascii="Microsoft YaHei" w:hAnsi="Microsoft YaHei" w:eastAsia="Microsoft YaHei"/>
+          <w:b w:val="0"/>
+          <w:color w:val="1A1A1A"/>
+          <w:sz w:val="22"/>
+        </w:rPr>
+        <w:t>本项工作的收益分三个层次呈现，各层的可见时点与验证方式不同，汇报时按实际取得的层次逐步报告。</w:t>
+      </w:r>
+    </w:p>
+    <w:tbl>
+      <w:tblPr>
+        <w:tblStyle w:val="TableGrid"/>
+        <w:tblW w:type="auto" w:w="0"/>
+        <w:jc w:val="center"/>
+        <w:tblLook w:firstColumn="1" w:firstRow="1" w:lastColumn="0" w:lastRow="0" w:noHBand="0" w:noVBand="1" w:val="04A0"/>
+      </w:tblPr>
+      <w:tblGrid>
+        <w:gridCol w:w="2294"/>
+        <w:gridCol w:w="2294"/>
+        <w:gridCol w:w="2294"/>
+        <w:gridCol w:w="2294"/>
+      </w:tblGrid>
+      <w:tr>
+        <w:tc>
+          <w:tcPr>
+            <w:tcW w:type="dxa" w:w="1020"/>
+            <w:shd w:val="clear" w:color="auto" w:fill="EDEFF3"/>
+          </w:tcPr>
+          <w:p>
+            <w:pPr>
+              <w:spacing w:after="20" w:line="276" w:lineRule="auto"/>
+            </w:pPr>
+            <w:r/>
+            <w:r>
+              <w:rPr>
+                <w:rFonts w:ascii="Microsoft YaHei" w:hAnsi="Microsoft YaHei" w:eastAsia="Microsoft YaHei"/>
+                <w:b/>
+                <w:color w:val="000000"/>
+                <w:sz w:val="18"/>
+              </w:rPr>
+              <w:t>层级</w:t>
+            </w:r>
+          </w:p>
+        </w:tc>
+        <w:tc>
+          <w:tcPr>
+            <w:tcW w:type="dxa" w:w="3061"/>
+            <w:shd w:val="clear" w:color="auto" w:fill="EDEFF3"/>
+          </w:tcPr>
+          <w:p>
+            <w:pPr>
+              <w:spacing w:after="20" w:line="276" w:lineRule="auto"/>
+            </w:pPr>
+            <w:r/>
+            <w:r>
+              <w:rPr>
+                <w:rFonts w:ascii="Microsoft YaHei" w:hAnsi="Microsoft YaHei" w:eastAsia="Microsoft YaHei"/>
+                <w:b/>
+                <w:color w:val="000000"/>
+                <w:sz w:val="18"/>
+              </w:rPr>
+              <w:t>收益内容</w:t>
+            </w:r>
+          </w:p>
+        </w:tc>
+        <w:tc>
+          <w:tcPr>
+            <w:tcW w:type="dxa" w:w="1701"/>
+            <w:shd w:val="clear" w:color="auto" w:fill="EDEFF3"/>
+          </w:tcPr>
+          <w:p>
+            <w:pPr>
+              <w:spacing w:after="20" w:line="276" w:lineRule="auto"/>
+            </w:pPr>
+            <w:r/>
+            <w:r>
+              <w:rPr>
+                <w:rFonts w:ascii="Microsoft YaHei" w:hAnsi="Microsoft YaHei" w:eastAsia="Microsoft YaHei"/>
+                <w:b/>
+                <w:color w:val="000000"/>
+                <w:sz w:val="18"/>
+              </w:rPr>
+              <w:t>可见时点</w:t>
+            </w:r>
+          </w:p>
+        </w:tc>
+        <w:tc>
+          <w:tcPr>
+            <w:tcW w:type="dxa" w:w="2721"/>
+            <w:shd w:val="clear" w:color="auto" w:fill="EDEFF3"/>
+          </w:tcPr>
+          <w:p>
+            <w:pPr>
+              <w:spacing w:after="20" w:line="276" w:lineRule="auto"/>
+            </w:pPr>
+            <w:r/>
+            <w:r>
+              <w:rPr>
+                <w:rFonts w:ascii="Microsoft YaHei" w:hAnsi="Microsoft YaHei" w:eastAsia="Microsoft YaHei"/>
+                <w:b/>
+                <w:color w:val="000000"/>
+                <w:sz w:val="18"/>
+              </w:rPr>
+              <w:t>验证方式</w:t>
+            </w:r>
+          </w:p>
+        </w:tc>
+      </w:tr>
+      <w:tr>
+        <w:tc>
+          <w:tcPr>
+            <w:tcW w:type="dxa" w:w="1020"/>
+          </w:tcPr>
+          <w:p>
+            <w:pPr>
+              <w:spacing w:after="20" w:line="276" w:lineRule="auto"/>
+            </w:pPr>
+            <w:r/>
+            <w:r>
+              <w:rPr>
+                <w:rFonts w:ascii="Microsoft YaHei" w:hAnsi="Microsoft YaHei" w:eastAsia="Microsoft YaHei"/>
+                <w:b/>
+                <w:color w:val="1A1A1A"/>
+                <w:sz w:val="18"/>
+              </w:rPr>
+              <w:t>直接</w:t>
+            </w:r>
+          </w:p>
+        </w:tc>
+        <w:tc>
+          <w:tcPr>
+            <w:tcW w:type="dxa" w:w="3061"/>
+          </w:tcPr>
+          <w:p>
+            <w:pPr>
+              <w:spacing w:after="20" w:line="276" w:lineRule="auto"/>
+            </w:pPr>
+            <w:r/>
+            <w:r>
+              <w:rPr>
+                <w:rFonts w:ascii="Microsoft YaHei" w:hAnsi="Microsoft YaHei" w:eastAsia="Microsoft YaHei"/>
+                <w:b w:val="0"/>
+                <w:color w:val="1A1A1A"/>
+                <w:sz w:val="18"/>
+              </w:rPr>
+              <w:t>重复性文档与数据汇编工作耗时下降</w:t>
+            </w:r>
+          </w:p>
+        </w:tc>
+        <w:tc>
+          <w:tcPr>
+            <w:tcW w:type="dxa" w:w="1701"/>
+          </w:tcPr>
+          <w:p>
+            <w:pPr>
+              <w:spacing w:after="20" w:line="276" w:lineRule="auto"/>
+            </w:pPr>
+            <w:r/>
+            <w:r>
+              <w:rPr>
+                <w:rFonts w:ascii="Microsoft YaHei" w:hAnsi="Microsoft YaHei" w:eastAsia="Microsoft YaHei"/>
+                <w:b w:val="0"/>
+                <w:color w:val="1A1A1A"/>
+                <w:sz w:val="18"/>
+              </w:rPr>
+              <w:t>试点 2–3 个月内</w:t>
+            </w:r>
+          </w:p>
+        </w:tc>
+        <w:tc>
+          <w:tcPr>
+            <w:tcW w:type="dxa" w:w="2721"/>
+          </w:tcPr>
+          <w:p>
+            <w:pPr>
+              <w:spacing w:after="20" w:line="276" w:lineRule="auto"/>
+            </w:pPr>
+            <w:r/>
+            <w:r>
+              <w:rPr>
+                <w:rFonts w:ascii="Microsoft YaHei" w:hAnsi="Microsoft YaHei" w:eastAsia="Microsoft YaHei"/>
+                <w:b w:val="0"/>
+                <w:color w:val="1A1A1A"/>
+                <w:sz w:val="18"/>
+              </w:rPr>
+              <w:t>同一工作内容前后耗时对比，多样本核算</w:t>
+            </w:r>
+          </w:p>
+        </w:tc>
+      </w:tr>
+      <w:tr>
+        <w:tc>
+          <w:tcPr>
+            <w:tcW w:type="dxa" w:w="1020"/>
+          </w:tcPr>
+          <w:p>
+            <w:pPr>
+              <w:spacing w:after="20" w:line="276" w:lineRule="auto"/>
+            </w:pPr>
+            <w:r/>
+            <w:r>
+              <w:rPr>
+                <w:rFonts w:ascii="Microsoft YaHei" w:hAnsi="Microsoft YaHei" w:eastAsia="Microsoft YaHei"/>
+                <w:b/>
+                <w:color w:val="1A1A1A"/>
+                <w:sz w:val="18"/>
+              </w:rPr>
+              <w:t>直接</w:t>
+            </w:r>
+          </w:p>
+        </w:tc>
+        <w:tc>
+          <w:tcPr>
+            <w:tcW w:type="dxa" w:w="3061"/>
+          </w:tcPr>
+          <w:p>
+            <w:pPr>
+              <w:spacing w:after="20" w:line="276" w:lineRule="auto"/>
+            </w:pPr>
+            <w:r/>
+            <w:r>
+              <w:rPr>
+                <w:rFonts w:ascii="Microsoft YaHei" w:hAnsi="Microsoft YaHei" w:eastAsia="Microsoft YaHei"/>
+                <w:b w:val="0"/>
+                <w:color w:val="1A1A1A"/>
+                <w:sz w:val="18"/>
+              </w:rPr>
+              <w:t>点检与巡检覆盖率提升、漏检减少</w:t>
+            </w:r>
+          </w:p>
+        </w:tc>
+        <w:tc>
+          <w:tcPr>
+            <w:tcW w:type="dxa" w:w="1701"/>
+          </w:tcPr>
+          <w:p>
+            <w:pPr>
+              <w:spacing w:after="20" w:line="276" w:lineRule="auto"/>
+            </w:pPr>
+            <w:r/>
+            <w:r>
+              <w:rPr>
+                <w:rFonts w:ascii="Microsoft YaHei" w:hAnsi="Microsoft YaHei" w:eastAsia="Microsoft YaHei"/>
+                <w:b w:val="0"/>
+                <w:color w:val="1A1A1A"/>
+                <w:sz w:val="18"/>
+              </w:rPr>
+              <w:t>试点 3–4 个月内</w:t>
+            </w:r>
+          </w:p>
+        </w:tc>
+        <w:tc>
+          <w:tcPr>
+            <w:tcW w:type="dxa" w:w="2721"/>
+          </w:tcPr>
+          <w:p>
+            <w:pPr>
+              <w:spacing w:after="20" w:line="276" w:lineRule="auto"/>
+            </w:pPr>
+            <w:r/>
+            <w:r>
+              <w:rPr>
+                <w:rFonts w:ascii="Microsoft YaHei" w:hAnsi="Microsoft YaHei" w:eastAsia="Microsoft YaHei"/>
+                <w:b w:val="0"/>
+                <w:color w:val="1A1A1A"/>
+                <w:sz w:val="18"/>
+              </w:rPr>
+              <w:t>覆盖点位数与异常发现数的前后对比</w:t>
+            </w:r>
+          </w:p>
+        </w:tc>
+      </w:tr>
+      <w:tr>
+        <w:tc>
+          <w:tcPr>
+            <w:tcW w:type="dxa" w:w="1020"/>
+          </w:tcPr>
+          <w:p>
+            <w:pPr>
+              <w:spacing w:after="20" w:line="276" w:lineRule="auto"/>
+            </w:pPr>
+            <w:r/>
+            <w:r>
+              <w:rPr>
+                <w:rFonts w:ascii="Microsoft YaHei" w:hAnsi="Microsoft YaHei" w:eastAsia="Microsoft YaHei"/>
+                <w:b/>
+                <w:color w:val="1A1A1A"/>
+                <w:sz w:val="18"/>
+              </w:rPr>
+              <w:t>间接</w:t>
+            </w:r>
+          </w:p>
+        </w:tc>
+        <w:tc>
+          <w:tcPr>
+            <w:tcW w:type="dxa" w:w="3061"/>
+          </w:tcPr>
+          <w:p>
+            <w:pPr>
+              <w:spacing w:after="20" w:line="276" w:lineRule="auto"/>
+            </w:pPr>
+            <w:r/>
+            <w:r>
+              <w:rPr>
+                <w:rFonts w:ascii="Microsoft YaHei" w:hAnsi="Microsoft YaHei" w:eastAsia="Microsoft YaHei"/>
+                <w:b w:val="0"/>
+                <w:color w:val="1A1A1A"/>
+                <w:sz w:val="18"/>
+              </w:rPr>
+              <w:t>技术文件质量一致性提升、返工减少</w:t>
+            </w:r>
+          </w:p>
+        </w:tc>
+        <w:tc>
+          <w:tcPr>
+            <w:tcW w:type="dxa" w:w="1701"/>
+          </w:tcPr>
+          <w:p>
+            <w:pPr>
+              <w:spacing w:after="20" w:line="276" w:lineRule="auto"/>
+            </w:pPr>
+            <w:r/>
+            <w:r>
+              <w:rPr>
+                <w:rFonts w:ascii="Microsoft YaHei" w:hAnsi="Microsoft YaHei" w:eastAsia="Microsoft YaHei"/>
+                <w:b w:val="0"/>
+                <w:color w:val="1A1A1A"/>
+                <w:sz w:val="18"/>
+              </w:rPr>
+              <w:t>6–9 个月</w:t>
+            </w:r>
+          </w:p>
+        </w:tc>
+        <w:tc>
+          <w:tcPr>
+            <w:tcW w:type="dxa" w:w="2721"/>
+          </w:tcPr>
+          <w:p>
+            <w:pPr>
+              <w:spacing w:after="20" w:line="276" w:lineRule="auto"/>
+            </w:pPr>
+            <w:r/>
+            <w:r>
+              <w:rPr>
+                <w:rFonts w:ascii="Microsoft YaHei" w:hAnsi="Microsoft YaHei" w:eastAsia="Microsoft YaHei"/>
+                <w:b w:val="0"/>
+                <w:color w:val="1A1A1A"/>
+                <w:sz w:val="18"/>
+              </w:rPr>
+              <w:t>返工次数与内外部反馈意见条数统计</w:t>
+            </w:r>
+          </w:p>
+        </w:tc>
+      </w:tr>
+      <w:tr>
+        <w:tc>
+          <w:tcPr>
+            <w:tcW w:type="dxa" w:w="1020"/>
+          </w:tcPr>
+          <w:p>
+            <w:pPr>
+              <w:spacing w:after="20" w:line="276" w:lineRule="auto"/>
+            </w:pPr>
+            <w:r/>
+            <w:r>
+              <w:rPr>
+                <w:rFonts w:ascii="Microsoft YaHei" w:hAnsi="Microsoft YaHei" w:eastAsia="Microsoft YaHei"/>
+                <w:b/>
+                <w:color w:val="1A1A1A"/>
+                <w:sz w:val="18"/>
+              </w:rPr>
+              <w:t>间接</w:t>
+            </w:r>
+          </w:p>
+        </w:tc>
+        <w:tc>
+          <w:tcPr>
+            <w:tcW w:type="dxa" w:w="3061"/>
+          </w:tcPr>
+          <w:p>
+            <w:pPr>
+              <w:spacing w:after="20" w:line="276" w:lineRule="auto"/>
+            </w:pPr>
+            <w:r/>
+            <w:r>
+              <w:rPr>
+                <w:rFonts w:ascii="Microsoft YaHei" w:hAnsi="Microsoft YaHei" w:eastAsia="Microsoft YaHei"/>
+                <w:b w:val="0"/>
+                <w:color w:val="1A1A1A"/>
+                <w:sz w:val="18"/>
+              </w:rPr>
+              <w:t>问题发现与响应时点提前，降低偏差与损失风险</w:t>
+            </w:r>
+          </w:p>
+        </w:tc>
+        <w:tc>
+          <w:tcPr>
+            <w:tcW w:type="dxa" w:w="1701"/>
+          </w:tcPr>
+          <w:p>
+            <w:pPr>
+              <w:spacing w:after="20" w:line="276" w:lineRule="auto"/>
+            </w:pPr>
+            <w:r/>
+            <w:r>
+              <w:rPr>
+                <w:rFonts w:ascii="Microsoft YaHei" w:hAnsi="Microsoft YaHei" w:eastAsia="Microsoft YaHei"/>
+                <w:b w:val="0"/>
+                <w:color w:val="1A1A1A"/>
+                <w:sz w:val="18"/>
+              </w:rPr>
+              <w:t>9–12 个月</w:t>
+            </w:r>
+          </w:p>
+        </w:tc>
+        <w:tc>
+          <w:tcPr>
+            <w:tcW w:type="dxa" w:w="2721"/>
+          </w:tcPr>
+          <w:p>
+            <w:pPr>
+              <w:spacing w:after="20" w:line="276" w:lineRule="auto"/>
+            </w:pPr>
+            <w:r/>
+            <w:r>
+              <w:rPr>
+                <w:rFonts w:ascii="Microsoft YaHei" w:hAnsi="Microsoft YaHei" w:eastAsia="Microsoft YaHei"/>
+                <w:b w:val="0"/>
+                <w:color w:val="1A1A1A"/>
+                <w:sz w:val="18"/>
+              </w:rPr>
+              <w:t>提前预警事件数，按保守口径计列</w:t>
+            </w:r>
+          </w:p>
+        </w:tc>
+      </w:tr>
+      <w:tr>
+        <w:tc>
+          <w:tcPr>
+            <w:tcW w:type="dxa" w:w="1020"/>
+          </w:tcPr>
+          <w:p>
+            <w:pPr>
+              <w:spacing w:after="20" w:line="276" w:lineRule="auto"/>
+            </w:pPr>
+            <w:r/>
+            <w:r>
+              <w:rPr>
+                <w:rFonts w:ascii="Microsoft YaHei" w:hAnsi="Microsoft YaHei" w:eastAsia="Microsoft YaHei"/>
+                <w:b/>
+                <w:color w:val="1A1A1A"/>
+                <w:sz w:val="18"/>
+              </w:rPr>
+              <w:t>战略</w:t>
+            </w:r>
+          </w:p>
+        </w:tc>
+        <w:tc>
+          <w:tcPr>
+            <w:tcW w:type="dxa" w:w="3061"/>
+          </w:tcPr>
+          <w:p>
+            <w:pPr>
+              <w:spacing w:after="20" w:line="276" w:lineRule="auto"/>
+            </w:pPr>
+            <w:r/>
+            <w:r>
+              <w:rPr>
+                <w:rFonts w:ascii="Microsoft YaHei" w:hAnsi="Microsoft YaHei" w:eastAsia="Microsoft YaHei"/>
+                <w:b w:val="0"/>
+                <w:color w:val="1A1A1A"/>
+                <w:sz w:val="18"/>
+              </w:rPr>
+              <w:t>形成面向客户审计与商务谈判的数字化能力证明</w:t>
+            </w:r>
+          </w:p>
+        </w:tc>
+        <w:tc>
+          <w:tcPr>
+            <w:tcW w:type="dxa" w:w="1701"/>
+          </w:tcPr>
+          <w:p>
+            <w:pPr>
+              <w:spacing w:after="20" w:line="276" w:lineRule="auto"/>
+            </w:pPr>
+            <w:r/>
+            <w:r>
+              <w:rPr>
+                <w:rFonts w:ascii="Microsoft YaHei" w:hAnsi="Microsoft YaHei" w:eastAsia="Microsoft YaHei"/>
+                <w:b w:val="0"/>
+                <w:color w:val="1A1A1A"/>
+                <w:sz w:val="18"/>
+              </w:rPr>
+              <w:t>12 个月以上</w:t>
+            </w:r>
+          </w:p>
+        </w:tc>
+        <w:tc>
+          <w:tcPr>
+            <w:tcW w:type="dxa" w:w="2721"/>
+          </w:tcPr>
+          <w:p>
+            <w:pPr>
+              <w:spacing w:after="20" w:line="276" w:lineRule="auto"/>
+            </w:pPr>
+            <w:r/>
+            <w:r>
+              <w:rPr>
+                <w:rFonts w:ascii="Microsoft YaHei" w:hAnsi="Microsoft YaHei" w:eastAsia="Microsoft YaHei"/>
+                <w:b w:val="0"/>
+                <w:color w:val="1A1A1A"/>
+                <w:sz w:val="18"/>
+              </w:rPr>
+              <w:t>可展示的系统、作业文件与应用案例</w:t>
+            </w:r>
+          </w:p>
+        </w:tc>
+      </w:tr>
+      <w:tr>
+        <w:tc>
+          <w:tcPr>
+            <w:tcW w:type="dxa" w:w="1020"/>
+          </w:tcPr>
+          <w:p>
+            <w:pPr>
+              <w:spacing w:after="20" w:line="276" w:lineRule="auto"/>
+            </w:pPr>
+            <w:r/>
+            <w:r>
+              <w:rPr>
+                <w:rFonts w:ascii="Microsoft YaHei" w:hAnsi="Microsoft YaHei" w:eastAsia="Microsoft YaHei"/>
+                <w:b/>
+                <w:color w:val="1A1A1A"/>
+                <w:sz w:val="18"/>
+              </w:rPr>
+              <w:t>战略</w:t>
+            </w:r>
+          </w:p>
+        </w:tc>
+        <w:tc>
+          <w:tcPr>
+            <w:tcW w:type="dxa" w:w="3061"/>
+          </w:tcPr>
+          <w:p>
+            <w:pPr>
+              <w:spacing w:after="20" w:line="276" w:lineRule="auto"/>
+            </w:pPr>
+            <w:r/>
+            <w:r>
+              <w:rPr>
+                <w:rFonts w:ascii="Microsoft YaHei" w:hAnsi="Microsoft YaHei" w:eastAsia="Microsoft YaHei"/>
+                <w:b w:val="0"/>
+                <w:color w:val="1A1A1A"/>
+                <w:sz w:val="18"/>
+              </w:rPr>
+              <w:t>数据与知识资产沉淀，形成公司自有能力</w:t>
+            </w:r>
+          </w:p>
+        </w:tc>
+        <w:tc>
+          <w:tcPr>
+            <w:tcW w:type="dxa" w:w="1701"/>
+          </w:tcPr>
+          <w:p>
+            <w:pPr>
+              <w:spacing w:after="20" w:line="276" w:lineRule="auto"/>
+            </w:pPr>
+            <w:r/>
+            <w:r>
+              <w:rPr>
+                <w:rFonts w:ascii="Microsoft YaHei" w:hAnsi="Microsoft YaHei" w:eastAsia="Microsoft YaHei"/>
+                <w:b w:val="0"/>
+                <w:color w:val="1A1A1A"/>
+                <w:sz w:val="18"/>
+              </w:rPr>
+              <w:t>持续</w:t>
+            </w:r>
+          </w:p>
+        </w:tc>
+        <w:tc>
+          <w:tcPr>
+            <w:tcW w:type="dxa" w:w="2721"/>
+          </w:tcPr>
+          <w:p>
+            <w:pPr>
+              <w:spacing w:after="20" w:line="276" w:lineRule="auto"/>
+            </w:pPr>
+            <w:r/>
+            <w:r>
+              <w:rPr>
+                <w:rFonts w:ascii="Microsoft YaHei" w:hAnsi="Microsoft YaHei" w:eastAsia="Microsoft YaHei"/>
+                <w:b w:val="0"/>
+                <w:color w:val="1A1A1A"/>
+                <w:sz w:val="18"/>
+              </w:rPr>
+              <w:t>数据目录完整度、知识库规模、内部掌握人数</w:t>
+            </w:r>
+          </w:p>
+        </w:tc>
+      </w:tr>
+    </w:tbl>
+    <w:p>
+      <w:pPr>
+        <w:spacing w:after="40"/>
+      </w:pPr>
+    </w:p>
+    <w:p>
+      <w:pPr>
+        <w:ind w:firstLine="420"/>
+      </w:pPr>
+      <w:r>
+        <w:rPr>
+          <w:rFonts w:ascii="Microsoft YaHei" w:hAnsi="Microsoft YaHei" w:eastAsia="Microsoft YaHei"/>
+          <w:b/>
+          <w:color w:val="1A1A1A"/>
+          <w:sz w:val="22"/>
+        </w:rPr>
+        <w:t>上述收益中，直接收益将以实际样本核算后据实报告；间接与战略收益作为趋势判断呈现，不作无依据的年化放大测算。</w:t>
+      </w:r>
+    </w:p>
+    <w:p>
+      <w:pPr>
+        <w:spacing w:before="280" w:after="100"/>
+      </w:pPr>
+      <w:r>
+        <w:rPr>
+          <w:rFonts w:ascii="Microsoft YaHei" w:hAnsi="Microsoft YaHei" w:eastAsia="Microsoft YaHei"/>
+          <w:b/>
+          <w:color w:val="000000"/>
+          <w:sz w:val="25"/>
+        </w:rPr>
+        <w:t>六、请予支持的三项机制事项</w:t>
+      </w:r>
+    </w:p>
+    <w:p>
+      <w:pPr>
+        <w:ind w:firstLine="420"/>
+      </w:pPr>
+      <w:r>
+        <w:rPr>
+          <w:rFonts w:ascii="Microsoft YaHei" w:hAnsi="Microsoft YaHei" w:eastAsia="Microsoft YaHei"/>
+          <w:b w:val="0"/>
+          <w:color w:val="1A1A1A"/>
+          <w:sz w:val="22"/>
+        </w:rPr>
+        <w:t>为保障上述阶段安排如期开展，恳请在机制层面给予以下三项支持。三项均不涉及预算与人员编制。</w:t>
       </w:r>
     </w:p>
     <w:p>
@@ -181,7 +2106,7 @@
     </w:p>
     <w:p>
       <w:pPr>
-        <w:spacing w:after="60" w:line="336" w:lineRule="auto"/>
+        <w:spacing w:after="60" w:line="324" w:lineRule="auto"/>
         <w:ind w:left="850"/>
       </w:pPr>
       <w:r>
@@ -196,7 +2121,7 @@
     </w:p>
     <w:p>
       <w:pPr>
-        <w:spacing w:after="60" w:line="336" w:lineRule="auto"/>
+        <w:spacing w:after="60" w:line="324" w:lineRule="auto"/>
         <w:ind w:left="850"/>
       </w:pPr>
       <w:r>
@@ -211,7 +2136,7 @@
     </w:p>
     <w:p>
       <w:pPr>
-        <w:spacing w:after="60" w:line="336" w:lineRule="auto"/>
+        <w:spacing w:after="60" w:line="324" w:lineRule="auto"/>
         <w:ind w:left="850"/>
       </w:pPr>
       <w:r>
@@ -241,7 +2166,7 @@
     </w:p>
     <w:p>
       <w:pPr>
-        <w:spacing w:after="60" w:line="336" w:lineRule="auto"/>
+        <w:spacing w:after="60" w:line="324" w:lineRule="auto"/>
         <w:ind w:left="850"/>
       </w:pPr>
       <w:r>
@@ -256,7 +2181,7 @@
     </w:p>
     <w:p>
       <w:pPr>
-        <w:spacing w:after="60" w:line="336" w:lineRule="auto"/>
+        <w:spacing w:after="60" w:line="324" w:lineRule="auto"/>
         <w:ind w:left="850"/>
       </w:pPr>
       <w:r>
@@ -271,7 +2196,7 @@
     </w:p>
     <w:p>
       <w:pPr>
-        <w:spacing w:after="60" w:line="336" w:lineRule="auto"/>
+        <w:spacing w:after="60" w:line="324" w:lineRule="auto"/>
         <w:ind w:left="850"/>
       </w:pPr>
       <w:r>
@@ -301,7 +2226,7 @@
     </w:p>
     <w:p>
       <w:pPr>
-        <w:spacing w:after="60" w:line="336" w:lineRule="auto"/>
+        <w:spacing w:after="60" w:line="324" w:lineRule="auto"/>
         <w:ind w:left="850"/>
       </w:pPr>
       <w:r>
@@ -316,7 +2241,7 @@
     </w:p>
     <w:p>
       <w:pPr>
-        <w:spacing w:after="60" w:line="336" w:lineRule="auto"/>
+        <w:spacing w:after="60" w:line="324" w:lineRule="auto"/>
         <w:ind w:left="850"/>
       </w:pPr>
       <w:r>
@@ -331,7 +2256,7 @@
     </w:p>
     <w:p>
       <w:pPr>
-        <w:spacing w:after="60" w:line="336" w:lineRule="auto"/>
+        <w:spacing w:after="60" w:line="324" w:lineRule="auto"/>
         <w:ind w:left="850"/>
       </w:pPr>
       <w:r>
@@ -346,7 +2271,7 @@
     </w:p>
     <w:p>
       <w:pPr>
-        <w:spacing w:after="60" w:line="336" w:lineRule="auto"/>
+        <w:spacing w:after="60" w:line="324" w:lineRule="auto"/>
         <w:ind w:left="850"/>
       </w:pPr>
       <w:r>
@@ -370,12 +2295,12 @@
           <w:color w:val="000000"/>
           <w:sz w:val="25"/>
         </w:rPr>
-        <w:t>三、对业务部门的投入承诺</w:t>
+        <w:t>七、请批示事项</w:t>
       </w:r>
     </w:p>
     <w:p>
       <w:pPr>
-        <w:ind w:left="0" w:firstLine="420"/>
+        <w:ind w:firstLine="420"/>
       </w:pPr>
       <w:r>
         <w:rPr>
@@ -384,854 +2309,12 @@
           <w:color w:val="1A1A1A"/>
           <w:sz w:val="22"/>
         </w:rPr>
-        <w:t>考虑生产任务实际负荷，本项工作明确对业务部门的投入上限如下。资料收集、数据整理、供应商对接、结果汇总与材料撰写等工作，均由推进牵头方承担，不向业务部门分派。</w:t>
-      </w:r>
-    </w:p>
-    <w:tbl>
-      <w:tblPr>
-        <w:tblStyle w:val="TableGrid"/>
-        <w:tblW w:type="auto" w:w="0"/>
-        <w:jc w:val="center"/>
-        <w:tblLook w:firstColumn="1" w:firstRow="1" w:lastColumn="0" w:lastRow="0" w:noHBand="0" w:noVBand="1" w:val="04A0"/>
-      </w:tblPr>
-      <w:tblGrid>
-        <w:gridCol w:w="3022"/>
-        <w:gridCol w:w="3022"/>
-        <w:gridCol w:w="3022"/>
-      </w:tblGrid>
-      <w:tr>
-        <w:tc>
-          <w:tcPr>
-            <w:tcW w:type="dxa" w:w="2211"/>
-            <w:shd w:val="clear" w:color="auto" w:fill="EDEFF3"/>
-          </w:tcPr>
-          <w:p>
-            <w:pPr>
-              <w:spacing w:after="20" w:line="276" w:lineRule="auto"/>
-            </w:pPr>
-            <w:r/>
-            <w:r>
-              <w:rPr>
-                <w:rFonts w:ascii="Microsoft YaHei" w:hAnsi="Microsoft YaHei" w:eastAsia="Microsoft YaHei"/>
-                <w:b/>
-                <w:color w:val="000000"/>
-                <w:sz w:val="20"/>
-              </w:rPr>
-              <w:t>部门 / 岗位</w:t>
-            </w:r>
-          </w:p>
-        </w:tc>
-        <w:tc>
-          <w:tcPr>
-            <w:tcW w:type="dxa" w:w="2041"/>
-            <w:shd w:val="clear" w:color="auto" w:fill="EDEFF3"/>
-          </w:tcPr>
-          <w:p>
-            <w:pPr>
-              <w:spacing w:after="20" w:line="276" w:lineRule="auto"/>
-            </w:pPr>
-            <w:r/>
-            <w:r>
-              <w:rPr>
-                <w:rFonts w:ascii="Microsoft YaHei" w:hAnsi="Microsoft YaHei" w:eastAsia="Microsoft YaHei"/>
-                <w:b/>
-                <w:color w:val="000000"/>
-                <w:sz w:val="20"/>
-              </w:rPr>
-              <w:t>投入上限</w:t>
-            </w:r>
-          </w:p>
-        </w:tc>
-        <w:tc>
-          <w:tcPr>
-            <w:tcW w:type="dxa" w:w="4252"/>
-            <w:shd w:val="clear" w:color="auto" w:fill="EDEFF3"/>
-          </w:tcPr>
-          <w:p>
-            <w:pPr>
-              <w:spacing w:after="20" w:line="276" w:lineRule="auto"/>
-            </w:pPr>
-            <w:r/>
-            <w:r>
-              <w:rPr>
-                <w:rFonts w:ascii="Microsoft YaHei" w:hAnsi="Microsoft YaHei" w:eastAsia="Microsoft YaHei"/>
-                <w:b/>
-                <w:color w:val="000000"/>
-                <w:sz w:val="20"/>
-              </w:rPr>
-              <w:t>承担事项</w:t>
-            </w:r>
-          </w:p>
-        </w:tc>
-      </w:tr>
-      <w:tr>
-        <w:tc>
-          <w:tcPr>
-            <w:tcW w:type="dxa" w:w="2211"/>
-          </w:tcPr>
-          <w:p>
-            <w:pPr>
-              <w:spacing w:after="20" w:line="276" w:lineRule="auto"/>
-            </w:pPr>
-            <w:r/>
-            <w:r>
-              <w:rPr>
-                <w:rFonts w:ascii="Microsoft YaHei" w:hAnsi="Microsoft YaHei" w:eastAsia="Microsoft YaHei"/>
-                <w:b w:val="0"/>
-                <w:color w:val="1A1A1A"/>
-                <w:sz w:val="20"/>
-              </w:rPr>
-              <w:t>车间主任 / 主管</w:t>
-            </w:r>
-          </w:p>
-        </w:tc>
-        <w:tc>
-          <w:tcPr>
-            <w:tcW w:type="dxa" w:w="2041"/>
-          </w:tcPr>
-          <w:p>
-            <w:pPr>
-              <w:spacing w:after="20" w:line="276" w:lineRule="auto"/>
-            </w:pPr>
-            <w:r/>
-            <w:r>
-              <w:rPr>
-                <w:rFonts w:ascii="Microsoft YaHei" w:hAnsi="Microsoft YaHei" w:eastAsia="Microsoft YaHei"/>
-                <w:b w:val="0"/>
-                <w:color w:val="1A1A1A"/>
-                <w:sz w:val="20"/>
-              </w:rPr>
-              <w:t>每月约 1 小时</w:t>
-            </w:r>
-          </w:p>
-        </w:tc>
-        <w:tc>
-          <w:tcPr>
-            <w:tcW w:type="dxa" w:w="4252"/>
-          </w:tcPr>
-          <w:p>
-            <w:pPr>
-              <w:spacing w:after="20" w:line="276" w:lineRule="auto"/>
-            </w:pPr>
-            <w:r/>
-            <w:r>
-              <w:rPr>
-                <w:rFonts w:ascii="Microsoft YaHei" w:hAnsi="Microsoft YaHei" w:eastAsia="Microsoft YaHei"/>
-                <w:b w:val="0"/>
-                <w:color w:val="1A1A1A"/>
-                <w:sz w:val="20"/>
-              </w:rPr>
-              <w:t>确认场景是否值得推进、确认试点结论</w:t>
-            </w:r>
-          </w:p>
-        </w:tc>
-      </w:tr>
-      <w:tr>
-        <w:tc>
-          <w:tcPr>
-            <w:tcW w:type="dxa" w:w="2211"/>
-          </w:tcPr>
-          <w:p>
-            <w:pPr>
-              <w:spacing w:after="20" w:line="276" w:lineRule="auto"/>
-            </w:pPr>
-            <w:r/>
-            <w:r>
-              <w:rPr>
-                <w:rFonts w:ascii="Microsoft YaHei" w:hAnsi="Microsoft YaHei" w:eastAsia="Microsoft YaHei"/>
-                <w:b w:val="0"/>
-                <w:color w:val="1A1A1A"/>
-                <w:sz w:val="20"/>
-              </w:rPr>
-              <w:t>工艺 / 技术人员</w:t>
-            </w:r>
-          </w:p>
-        </w:tc>
-        <w:tc>
-          <w:tcPr>
-            <w:tcW w:type="dxa" w:w="2041"/>
-          </w:tcPr>
-          <w:p>
-            <w:pPr>
-              <w:spacing w:after="20" w:line="276" w:lineRule="auto"/>
-            </w:pPr>
-            <w:r/>
-            <w:r>
-              <w:rPr>
-                <w:rFonts w:ascii="Microsoft YaHei" w:hAnsi="Microsoft YaHei" w:eastAsia="Microsoft YaHei"/>
-                <w:b w:val="0"/>
-                <w:color w:val="1A1A1A"/>
-                <w:sz w:val="20"/>
-              </w:rPr>
-              <w:t>每周不超过 1 小时</w:t>
-            </w:r>
-          </w:p>
-        </w:tc>
-        <w:tc>
-          <w:tcPr>
-            <w:tcW w:type="dxa" w:w="4252"/>
-          </w:tcPr>
-          <w:p>
-            <w:pPr>
-              <w:spacing w:after="20" w:line="276" w:lineRule="auto"/>
-            </w:pPr>
-            <w:r/>
-            <w:r>
-              <w:rPr>
-                <w:rFonts w:ascii="Microsoft YaHei" w:hAnsi="Microsoft YaHei" w:eastAsia="Microsoft YaHei"/>
-                <w:b w:val="0"/>
-                <w:color w:val="1A1A1A"/>
-                <w:sz w:val="20"/>
-              </w:rPr>
-              <w:t>判断输出结果是否可用、指出问题所在</w:t>
-            </w:r>
-          </w:p>
-        </w:tc>
-      </w:tr>
-      <w:tr>
-        <w:tc>
-          <w:tcPr>
-            <w:tcW w:type="dxa" w:w="2211"/>
-          </w:tcPr>
-          <w:p>
-            <w:pPr>
-              <w:spacing w:after="20" w:line="276" w:lineRule="auto"/>
-            </w:pPr>
-            <w:r/>
-            <w:r>
-              <w:rPr>
-                <w:rFonts w:ascii="Microsoft YaHei" w:hAnsi="Microsoft YaHei" w:eastAsia="Microsoft YaHei"/>
-                <w:b w:val="0"/>
-                <w:color w:val="1A1A1A"/>
-                <w:sz w:val="20"/>
-              </w:rPr>
-              <w:t>一线操作 / 点检人员</w:t>
-            </w:r>
-          </w:p>
-        </w:tc>
-        <w:tc>
-          <w:tcPr>
-            <w:tcW w:type="dxa" w:w="2041"/>
-          </w:tcPr>
-          <w:p>
-            <w:pPr>
-              <w:spacing w:after="20" w:line="276" w:lineRule="auto"/>
-            </w:pPr>
-            <w:r/>
-            <w:r>
-              <w:rPr>
-                <w:rFonts w:ascii="Microsoft YaHei" w:hAnsi="Microsoft YaHei" w:eastAsia="Microsoft YaHei"/>
-                <w:b w:val="0"/>
-                <w:color w:val="1A1A1A"/>
-                <w:sz w:val="20"/>
-              </w:rPr>
-              <w:t>每次不超过 5 分钟</w:t>
-            </w:r>
-          </w:p>
-        </w:tc>
-        <w:tc>
-          <w:tcPr>
-            <w:tcW w:type="dxa" w:w="4252"/>
-          </w:tcPr>
-          <w:p>
-            <w:pPr>
-              <w:spacing w:after="20" w:line="276" w:lineRule="auto"/>
-            </w:pPr>
-            <w:r/>
-            <w:r>
-              <w:rPr>
-                <w:rFonts w:ascii="Microsoft YaHei" w:hAnsi="Microsoft YaHei" w:eastAsia="Microsoft YaHei"/>
-                <w:b w:val="0"/>
-                <w:color w:val="1A1A1A"/>
-                <w:sz w:val="20"/>
-              </w:rPr>
-              <w:t>在既有操作流程中确认结果，不额外填表</w:t>
-            </w:r>
-          </w:p>
-        </w:tc>
-      </w:tr>
-      <w:tr>
-        <w:tc>
-          <w:tcPr>
-            <w:tcW w:type="dxa" w:w="2211"/>
-          </w:tcPr>
-          <w:p>
-            <w:pPr>
-              <w:spacing w:after="20" w:line="276" w:lineRule="auto"/>
-            </w:pPr>
-            <w:r/>
-            <w:r>
-              <w:rPr>
-                <w:rFonts w:ascii="Microsoft YaHei" w:hAnsi="Microsoft YaHei" w:eastAsia="Microsoft YaHei"/>
-                <w:b w:val="0"/>
-                <w:color w:val="1A1A1A"/>
-                <w:sz w:val="20"/>
-              </w:rPr>
-              <w:t>质量部门</w:t>
-            </w:r>
-          </w:p>
-        </w:tc>
-        <w:tc>
-          <w:tcPr>
-            <w:tcW w:type="dxa" w:w="2041"/>
-          </w:tcPr>
-          <w:p>
-            <w:pPr>
-              <w:spacing w:after="20" w:line="276" w:lineRule="auto"/>
-            </w:pPr>
-            <w:r/>
-            <w:r>
-              <w:rPr>
-                <w:rFonts w:ascii="Microsoft YaHei" w:hAnsi="Microsoft YaHei" w:eastAsia="Microsoft YaHei"/>
-                <w:b w:val="0"/>
-                <w:color w:val="1A1A1A"/>
-                <w:sz w:val="20"/>
-              </w:rPr>
-              <w:t>关键节点各约 1 小时</w:t>
-            </w:r>
-          </w:p>
-        </w:tc>
-        <w:tc>
-          <w:tcPr>
-            <w:tcW w:type="dxa" w:w="4252"/>
-          </w:tcPr>
-          <w:p>
-            <w:pPr>
-              <w:spacing w:after="20" w:line="276" w:lineRule="auto"/>
-            </w:pPr>
-            <w:r/>
-            <w:r>
-              <w:rPr>
-                <w:rFonts w:ascii="Microsoft YaHei" w:hAnsi="Microsoft YaHei" w:eastAsia="Microsoft YaHei"/>
-                <w:b w:val="0"/>
-                <w:color w:val="1A1A1A"/>
-                <w:sz w:val="20"/>
-              </w:rPr>
-              <w:t>明确合规边界与记录留痕要求</w:t>
-            </w:r>
-          </w:p>
-        </w:tc>
-      </w:tr>
-      <w:tr>
-        <w:tc>
-          <w:tcPr>
-            <w:tcW w:type="dxa" w:w="2211"/>
-          </w:tcPr>
-          <w:p>
-            <w:pPr>
-              <w:spacing w:after="20" w:line="276" w:lineRule="auto"/>
-            </w:pPr>
-            <w:r/>
-            <w:r>
-              <w:rPr>
-                <w:rFonts w:ascii="Microsoft YaHei" w:hAnsi="Microsoft YaHei" w:eastAsia="Microsoft YaHei"/>
-                <w:b w:val="0"/>
-                <w:color w:val="1A1A1A"/>
-                <w:sz w:val="20"/>
-              </w:rPr>
-              <w:t>信息部门</w:t>
-            </w:r>
-          </w:p>
-        </w:tc>
-        <w:tc>
-          <w:tcPr>
-            <w:tcW w:type="dxa" w:w="2041"/>
-          </w:tcPr>
-          <w:p>
-            <w:pPr>
-              <w:spacing w:after="20" w:line="276" w:lineRule="auto"/>
-            </w:pPr>
-            <w:r/>
-            <w:r>
-              <w:rPr>
-                <w:rFonts w:ascii="Microsoft YaHei" w:hAnsi="Microsoft YaHei" w:eastAsia="Microsoft YaHei"/>
-                <w:b w:val="0"/>
-                <w:color w:val="1A1A1A"/>
-                <w:sz w:val="20"/>
-              </w:rPr>
-              <w:t>阶段性集中 3–5 天</w:t>
-            </w:r>
-          </w:p>
-        </w:tc>
-        <w:tc>
-          <w:tcPr>
-            <w:tcW w:type="dxa" w:w="4252"/>
-          </w:tcPr>
-          <w:p>
-            <w:pPr>
-              <w:spacing w:after="20" w:line="276" w:lineRule="auto"/>
-            </w:pPr>
-            <w:r/>
-            <w:r>
-              <w:rPr>
-                <w:rFonts w:ascii="Microsoft YaHei" w:hAnsi="Microsoft YaHei" w:eastAsia="Microsoft YaHei"/>
-                <w:b w:val="0"/>
-                <w:color w:val="1A1A1A"/>
-                <w:sz w:val="20"/>
-              </w:rPr>
-              <w:t>开通查询权限、说明系统接口可行性</w:t>
-            </w:r>
-          </w:p>
-        </w:tc>
-      </w:tr>
-    </w:tbl>
-    <w:p>
-      <w:pPr>
-        <w:spacing w:after="40"/>
-      </w:pPr>
-    </w:p>
-    <w:p>
-      <w:pPr>
-        <w:spacing w:before="280" w:after="100"/>
-      </w:pPr>
-      <w:r>
-        <w:rPr>
-          <w:rFonts w:ascii="Microsoft YaHei" w:hAnsi="Microsoft YaHei" w:eastAsia="Microsoft YaHei"/>
-          <w:b/>
-          <w:color w:val="000000"/>
-          <w:sz w:val="25"/>
-        </w:rPr>
-        <w:t>四、近期工作安排</w:t>
-      </w:r>
-    </w:p>
-    <w:tbl>
-      <w:tblPr>
-        <w:tblStyle w:val="TableGrid"/>
-        <w:tblW w:type="auto" w:w="0"/>
-        <w:jc w:val="center"/>
-        <w:tblLook w:firstColumn="1" w:firstRow="1" w:lastColumn="0" w:lastRow="0" w:noHBand="0" w:noVBand="1" w:val="04A0"/>
-      </w:tblPr>
-      <w:tblGrid>
-        <w:gridCol w:w="3022"/>
-        <w:gridCol w:w="3022"/>
-        <w:gridCol w:w="3022"/>
-      </w:tblGrid>
-      <w:tr>
-        <w:tc>
-          <w:tcPr>
-            <w:tcW w:type="dxa" w:w="1587"/>
-            <w:shd w:val="clear" w:color="auto" w:fill="EDEFF3"/>
-          </w:tcPr>
-          <w:p>
-            <w:pPr>
-              <w:spacing w:after="20" w:line="276" w:lineRule="auto"/>
-            </w:pPr>
-            <w:r/>
-            <w:r>
-              <w:rPr>
-                <w:rFonts w:ascii="Microsoft YaHei" w:hAnsi="Microsoft YaHei" w:eastAsia="Microsoft YaHei"/>
-                <w:b/>
-                <w:color w:val="000000"/>
-                <w:sz w:val="20"/>
-              </w:rPr>
-              <w:t>时间</w:t>
-            </w:r>
-          </w:p>
-        </w:tc>
-        <w:tc>
-          <w:tcPr>
-            <w:tcW w:type="dxa" w:w="3742"/>
-            <w:shd w:val="clear" w:color="auto" w:fill="EDEFF3"/>
-          </w:tcPr>
-          <w:p>
-            <w:pPr>
-              <w:spacing w:after="20" w:line="276" w:lineRule="auto"/>
-            </w:pPr>
-            <w:r/>
-            <w:r>
-              <w:rPr>
-                <w:rFonts w:ascii="Microsoft YaHei" w:hAnsi="Microsoft YaHei" w:eastAsia="Microsoft YaHei"/>
-                <w:b/>
-                <w:color w:val="000000"/>
-                <w:sz w:val="20"/>
-              </w:rPr>
-              <w:t>工作内容</w:t>
-            </w:r>
-          </w:p>
-        </w:tc>
-        <w:tc>
-          <w:tcPr>
-            <w:tcW w:type="dxa" w:w="3175"/>
-            <w:shd w:val="clear" w:color="auto" w:fill="EDEFF3"/>
-          </w:tcPr>
-          <w:p>
-            <w:pPr>
-              <w:spacing w:after="20" w:line="276" w:lineRule="auto"/>
-            </w:pPr>
-            <w:r/>
-            <w:r>
-              <w:rPr>
-                <w:rFonts w:ascii="Microsoft YaHei" w:hAnsi="Microsoft YaHei" w:eastAsia="Microsoft YaHei"/>
-                <w:b/>
-                <w:color w:val="000000"/>
-                <w:sz w:val="20"/>
-              </w:rPr>
-              <w:t>阶段成果</w:t>
-            </w:r>
-          </w:p>
-        </w:tc>
-      </w:tr>
-      <w:tr>
-        <w:tc>
-          <w:tcPr>
-            <w:tcW w:type="dxa" w:w="1587"/>
-          </w:tcPr>
-          <w:p>
-            <w:pPr>
-              <w:spacing w:after="20" w:line="276" w:lineRule="auto"/>
-            </w:pPr>
-            <w:r/>
-            <w:r>
-              <w:rPr>
-                <w:rFonts w:ascii="Microsoft YaHei" w:hAnsi="Microsoft YaHei" w:eastAsia="Microsoft YaHei"/>
-                <w:b w:val="0"/>
-                <w:color w:val="1A1A1A"/>
-                <w:sz w:val="20"/>
-              </w:rPr>
-              <w:t>第 1 个月</w:t>
-            </w:r>
-          </w:p>
-        </w:tc>
-        <w:tc>
-          <w:tcPr>
-            <w:tcW w:type="dxa" w:w="3742"/>
-          </w:tcPr>
-          <w:p>
-            <w:pPr>
-              <w:spacing w:after="20" w:line="276" w:lineRule="auto"/>
-            </w:pPr>
-            <w:r/>
-            <w:r>
-              <w:rPr>
-                <w:rFonts w:ascii="Microsoft YaHei" w:hAnsi="Microsoft YaHei" w:eastAsia="Microsoft YaHei"/>
-                <w:b w:val="0"/>
-                <w:color w:val="1A1A1A"/>
-                <w:sz w:val="20"/>
-              </w:rPr>
-              <w:t>机制落地，完成访谈准备</w:t>
-            </w:r>
-          </w:p>
-        </w:tc>
-        <w:tc>
-          <w:tcPr>
-            <w:tcW w:type="dxa" w:w="3175"/>
-          </w:tcPr>
-          <w:p>
-            <w:pPr>
-              <w:spacing w:after="20" w:line="276" w:lineRule="auto"/>
-            </w:pPr>
-            <w:r/>
-            <w:r>
-              <w:rPr>
-                <w:rFonts w:ascii="Microsoft YaHei" w:hAnsi="Microsoft YaHei" w:eastAsia="Microsoft YaHei"/>
-                <w:b w:val="0"/>
-                <w:color w:val="1A1A1A"/>
-                <w:sz w:val="20"/>
-              </w:rPr>
-              <w:t>联络员名单、权限开通</w:t>
-            </w:r>
-          </w:p>
-        </w:tc>
-      </w:tr>
-      <w:tr>
-        <w:tc>
-          <w:tcPr>
-            <w:tcW w:type="dxa" w:w="1587"/>
-          </w:tcPr>
-          <w:p>
-            <w:pPr>
-              <w:spacing w:after="20" w:line="276" w:lineRule="auto"/>
-            </w:pPr>
-            <w:r/>
-            <w:r>
-              <w:rPr>
-                <w:rFonts w:ascii="Microsoft YaHei" w:hAnsi="Microsoft YaHei" w:eastAsia="Microsoft YaHei"/>
-                <w:b w:val="0"/>
-                <w:color w:val="1A1A1A"/>
-                <w:sz w:val="20"/>
-              </w:rPr>
-              <w:t>第 1–2 个月</w:t>
-            </w:r>
-          </w:p>
-        </w:tc>
-        <w:tc>
-          <w:tcPr>
-            <w:tcW w:type="dxa" w:w="3742"/>
-          </w:tcPr>
-          <w:p>
-            <w:pPr>
-              <w:spacing w:after="20" w:line="276" w:lineRule="auto"/>
-            </w:pPr>
-            <w:r/>
-            <w:r>
-              <w:rPr>
-                <w:rFonts w:ascii="Microsoft YaHei" w:hAnsi="Microsoft YaHei" w:eastAsia="Microsoft YaHei"/>
-                <w:b w:val="0"/>
-                <w:color w:val="1A1A1A"/>
-                <w:sz w:val="20"/>
-              </w:rPr>
-              <w:t>开展 15–20 人次现场访谈</w:t>
-            </w:r>
-          </w:p>
-        </w:tc>
-        <w:tc>
-          <w:tcPr>
-            <w:tcW w:type="dxa" w:w="3175"/>
-          </w:tcPr>
-          <w:p>
-            <w:pPr>
-              <w:spacing w:after="20" w:line="276" w:lineRule="auto"/>
-            </w:pPr>
-            <w:r/>
-            <w:r>
-              <w:rPr>
-                <w:rFonts w:ascii="Microsoft YaHei" w:hAnsi="Microsoft YaHei" w:eastAsia="Microsoft YaHei"/>
-                <w:b w:val="0"/>
-                <w:color w:val="1A1A1A"/>
-                <w:sz w:val="20"/>
-              </w:rPr>
-              <w:t>生产场景清单及工时排序</w:t>
-            </w:r>
-          </w:p>
-        </w:tc>
-      </w:tr>
-      <w:tr>
-        <w:tc>
-          <w:tcPr>
-            <w:tcW w:type="dxa" w:w="1587"/>
-          </w:tcPr>
-          <w:p>
-            <w:pPr>
-              <w:spacing w:after="20" w:line="276" w:lineRule="auto"/>
-            </w:pPr>
-            <w:r/>
-            <w:r>
-              <w:rPr>
-                <w:rFonts w:ascii="Microsoft YaHei" w:hAnsi="Microsoft YaHei" w:eastAsia="Microsoft YaHei"/>
-                <w:b w:val="0"/>
-                <w:color w:val="1A1A1A"/>
-                <w:sz w:val="20"/>
-              </w:rPr>
-              <w:t>第 2–3 个月</w:t>
-            </w:r>
-          </w:p>
-        </w:tc>
-        <w:tc>
-          <w:tcPr>
-            <w:tcW w:type="dxa" w:w="3742"/>
-          </w:tcPr>
-          <w:p>
-            <w:pPr>
-              <w:spacing w:after="20" w:line="276" w:lineRule="auto"/>
-            </w:pPr>
-            <w:r/>
-            <w:r>
-              <w:rPr>
-                <w:rFonts w:ascii="Microsoft YaHei" w:hAnsi="Microsoft YaHei" w:eastAsia="Microsoft YaHei"/>
-                <w:b w:val="0"/>
-                <w:color w:val="1A1A1A"/>
-                <w:sz w:val="20"/>
-              </w:rPr>
-              <w:t>评估各系统数据可用条件</w:t>
-            </w:r>
-          </w:p>
-        </w:tc>
-        <w:tc>
-          <w:tcPr>
-            <w:tcW w:type="dxa" w:w="3175"/>
-          </w:tcPr>
-          <w:p>
-            <w:pPr>
-              <w:spacing w:after="20" w:line="276" w:lineRule="auto"/>
-            </w:pPr>
-            <w:r/>
-            <w:r>
-              <w:rPr>
-                <w:rFonts w:ascii="Microsoft YaHei" w:hAnsi="Microsoft YaHei" w:eastAsia="Microsoft YaHei"/>
-                <w:b w:val="0"/>
-                <w:color w:val="1A1A1A"/>
-                <w:sz w:val="20"/>
-              </w:rPr>
-              <w:t>数据就绪度评估结论</w:t>
-            </w:r>
-          </w:p>
-        </w:tc>
-      </w:tr>
-      <w:tr>
-        <w:tc>
-          <w:tcPr>
-            <w:tcW w:type="dxa" w:w="1587"/>
-          </w:tcPr>
-          <w:p>
-            <w:pPr>
-              <w:spacing w:after="20" w:line="276" w:lineRule="auto"/>
-            </w:pPr>
-            <w:r/>
-            <w:r>
-              <w:rPr>
-                <w:rFonts w:ascii="Microsoft YaHei" w:hAnsi="Microsoft YaHei" w:eastAsia="Microsoft YaHei"/>
-                <w:b w:val="0"/>
-                <w:color w:val="1A1A1A"/>
-                <w:sz w:val="20"/>
-              </w:rPr>
-              <w:t>第 3–4 个月</w:t>
-            </w:r>
-          </w:p>
-        </w:tc>
-        <w:tc>
-          <w:tcPr>
-            <w:tcW w:type="dxa" w:w="3742"/>
-          </w:tcPr>
-          <w:p>
-            <w:pPr>
-              <w:spacing w:after="20" w:line="276" w:lineRule="auto"/>
-            </w:pPr>
-            <w:r/>
-            <w:r>
-              <w:rPr>
-                <w:rFonts w:ascii="Microsoft YaHei" w:hAnsi="Microsoft YaHei" w:eastAsia="Microsoft YaHei"/>
-                <w:b w:val="0"/>
-                <w:color w:val="1A1A1A"/>
-                <w:sz w:val="20"/>
-              </w:rPr>
-              <w:t>组织外部技术交流与能力比较</w:t>
-            </w:r>
-          </w:p>
-        </w:tc>
-        <w:tc>
-          <w:tcPr>
-            <w:tcW w:type="dxa" w:w="3175"/>
-          </w:tcPr>
-          <w:p>
-            <w:pPr>
-              <w:spacing w:after="20" w:line="276" w:lineRule="auto"/>
-            </w:pPr>
-            <w:r/>
-            <w:r>
-              <w:rPr>
-                <w:rFonts w:ascii="Microsoft YaHei" w:hAnsi="Microsoft YaHei" w:eastAsia="Microsoft YaHei"/>
-                <w:b w:val="0"/>
-                <w:color w:val="1A1A1A"/>
-                <w:sz w:val="20"/>
-              </w:rPr>
-              <w:t>供应商能力对比及数据要求清单</w:t>
-            </w:r>
-          </w:p>
-        </w:tc>
-      </w:tr>
-      <w:tr>
-        <w:tc>
-          <w:tcPr>
-            <w:tcW w:type="dxa" w:w="1587"/>
-          </w:tcPr>
-          <w:p>
-            <w:pPr>
-              <w:spacing w:after="20" w:line="276" w:lineRule="auto"/>
-            </w:pPr>
-            <w:r/>
-            <w:r>
-              <w:rPr>
-                <w:rFonts w:ascii="Microsoft YaHei" w:hAnsi="Microsoft YaHei" w:eastAsia="Microsoft YaHei"/>
-                <w:b w:val="0"/>
-                <w:color w:val="1A1A1A"/>
-                <w:sz w:val="20"/>
-              </w:rPr>
-              <w:t>第 4–5 个月</w:t>
-            </w:r>
-          </w:p>
-        </w:tc>
-        <w:tc>
-          <w:tcPr>
-            <w:tcW w:type="dxa" w:w="3742"/>
-          </w:tcPr>
-          <w:p>
-            <w:pPr>
-              <w:spacing w:after="20" w:line="276" w:lineRule="auto"/>
-            </w:pPr>
-            <w:r/>
-            <w:r>
-              <w:rPr>
-                <w:rFonts w:ascii="Microsoft YaHei" w:hAnsi="Microsoft YaHei" w:eastAsia="Microsoft YaHei"/>
-                <w:b w:val="0"/>
-                <w:color w:val="1A1A1A"/>
-                <w:sz w:val="20"/>
-              </w:rPr>
-              <w:t>提出试点场景建议</w:t>
-            </w:r>
-          </w:p>
-        </w:tc>
-        <w:tc>
-          <w:tcPr>
-            <w:tcW w:type="dxa" w:w="3175"/>
-          </w:tcPr>
-          <w:p>
-            <w:pPr>
-              <w:spacing w:after="20" w:line="276" w:lineRule="auto"/>
-            </w:pPr>
-            <w:r/>
-            <w:r>
-              <w:rPr>
-                <w:rFonts w:ascii="Microsoft YaHei" w:hAnsi="Microsoft YaHei" w:eastAsia="Microsoft YaHei"/>
-                <w:b w:val="0"/>
-                <w:color w:val="1A1A1A"/>
-                <w:sz w:val="20"/>
-              </w:rPr>
-              <w:t>试点方案及投入申请</w:t>
-            </w:r>
-          </w:p>
-        </w:tc>
-      </w:tr>
-    </w:tbl>
-    <w:p>
-      <w:pPr>
-        <w:spacing w:after="40"/>
-      </w:pPr>
-    </w:p>
-    <w:p>
-      <w:pPr>
-        <w:ind w:left="0" w:firstLine="420"/>
-      </w:pPr>
-      <w:r>
-        <w:rPr>
-          <w:rFonts w:ascii="Microsoft YaHei" w:hAnsi="Microsoft YaHei" w:eastAsia="Microsoft YaHei"/>
-          <w:b/>
-          <w:color w:val="1A1A1A"/>
-          <w:sz w:val="22"/>
-        </w:rPr>
-        <w:t>以上各阶段均不需预算支持。试点实施所需费用，将在场景与范围确定后另行请示。</w:t>
+        <w:t>恳请对第六条所列三项机制事项予以批示。如蒙同意，建议一并明确联络员报送方式与时限，并由信息部门按第（三）项所述范围办理权限开通。</w:t>
       </w:r>
     </w:p>
     <w:p>
       <w:pPr>
-        <w:spacing w:before="280" w:after="100"/>
-      </w:pPr>
-      <w:r>
-        <w:rPr>
-          <w:rFonts w:ascii="Microsoft YaHei" w:hAnsi="Microsoft YaHei" w:eastAsia="Microsoft YaHei"/>
-          <w:b/>
-          <w:color w:val="000000"/>
-          <w:sz w:val="25"/>
-        </w:rPr>
-        <w:t>五、请批示事项</w:t>
-      </w:r>
-    </w:p>
-    <w:p>
-      <w:pPr>
-        <w:ind w:left="0" w:firstLine="420"/>
-      </w:pPr>
-      <w:r>
-        <w:rPr>
-          <w:rFonts w:ascii="Microsoft YaHei" w:hAnsi="Microsoft YaHei" w:eastAsia="Microsoft YaHei"/>
-          <w:b w:val="0"/>
-          <w:color w:val="1A1A1A"/>
-          <w:sz w:val="22"/>
-        </w:rPr>
-        <w:t>恳请对上述三项机制建议予以批示。如蒙同意，建议一并明确联络员报送方式与时限，并由信息部门按第二条第（三）项所述范围办理权限开通。</w:t>
-      </w:r>
-    </w:p>
-    <w:p>
-      <w:pPr>
-        <w:ind w:left="0" w:firstLine="420"/>
+        <w:ind w:firstLine="420"/>
       </w:pPr>
       <w:r>
         <w:rPr>
@@ -1245,7 +2328,7 @@
     </w:p>
     <w:p>
       <w:pPr>
-        <w:spacing w:before="440"/>
+        <w:spacing w:before="400"/>
         <w:jc w:val="right"/>
       </w:pPr>
       <w:r>
@@ -1260,7 +2343,7 @@
     </w:p>
     <w:sectPr>
       <w:pgSz w:w="12240" w:h="15840"/>
-      <w:pgMar w:top="1474" w:right="1587" w:bottom="1361" w:left="1587" w:header="720" w:footer="720" w:gutter="0"/>
+      <w:pgMar w:top="1417" w:right="1531" w:bottom="1304" w:left="1531" w:header="720" w:footer="720" w:gutter="0"/>
       <w:cols w:space="720"/>
       <w:docGrid w:linePitch="360"/>
     </w:sectPr>
@@ -1632,7 +2715,7 @@
     <w:qFormat/>
     <w:rsid w:val="00FC693F"/>
     <w:pPr>
-      <w:spacing w:after="120" w:line="360" w:lineRule="auto"/>
+      <w:spacing w:after="120" w:line="348" w:lineRule="auto"/>
     </w:pPr>
     <w:rPr>
       <w:rFonts w:ascii="Microsoft YaHei" w:hAnsi="Microsoft YaHei" w:eastAsia="Microsoft YaHei"/>

</xml_diff>